<commit_message>
docs: EV02 v2 espejo del ejemplo-modelo (intro, TOC, snippets, anexos con capturas)
</commit_message>
<xml_diff>
--- a/docs/ev02/EV02-InvenXis-GA8-220501096-AA1-EV02.docx
+++ b/docs/ev02/EV02-InvenXis-GA8-220501096-AA1-EV02.docx
@@ -9,7 +9,9 @@
         </w:rPr>
         <w:t>SERVICIO NACIONAL DE APRENDIZAJE — SENA</w:t>
         <w:br/>
-        <w:t>Centro de Comercio y Turismo · Regional Quindío · ADSO</w:t>
+        <w:t>Centro de Comercio y Turismo — SENA Regional Quindío</w:t>
+        <w:br/>
+        <w:t>Análisis y Desarrollo de Software</w:t>
       </w:r>
     </w:p>
     <w:p>
@@ -19,275 +21,67 @@
           <w:color w:val="00843D"/>
           <w:sz w:val="48"/>
         </w:rPr>
-        <w:t>InvenXis — Sistema de Gestión de Inventarios</w:t>
+        <w:t>GA8-220501096-AA1-EV02 — Módulos integrados</w:t>
+      </w:r>
+    </w:p>
+    <w:p>
+      <w:r>
+        <w:t>Proyecto InvenXis — Sistema de gestión de inventarios, proveedores, ventas y facturación electrónica</w:t>
       </w:r>
     </w:p>
     <w:p>
       <w:pPr>
-        <w:pStyle w:val="Heading2"/>
+        <w:jc w:val="center"/>
       </w:pPr>
       <w:r>
-        <w:t>Evidencia GA8-220501096-AA1-EV02: Módulos Integrados</w:t>
+        <w:rPr>
+          <w:b/>
+        </w:rPr>
+        <w:t>Aprendiz: [NOMBRE DEL APRENDIZ]</w:t>
       </w:r>
     </w:p>
-    <w:tbl>
-      <w:tblPr>
-        <w:tblStyle w:val="TableGrid"/>
-        <w:tblW w:type="auto" w:w="0"/>
-        <w:jc w:val="left"/>
-        <w:tblLook w:firstColumn="1" w:firstRow="1" w:lastColumn="0" w:lastRow="0" w:noHBand="0" w:noVBand="1" w:val="04A0"/>
-      </w:tblPr>
-      <w:tblGrid>
-        <w:gridCol w:w="4986"/>
-        <w:gridCol w:w="4986"/>
-      </w:tblGrid>
-      <w:tr>
-        <w:tc>
-          <w:tcPr>
-            <w:tcW w:type="dxa" w:w="2268"/>
-          </w:tcPr>
-          <w:p>
-            <w:r/>
-            <w:r>
-              <w:rPr>
-                <w:b/>
-                <w:sz w:val="18"/>
-              </w:rPr>
-              <w:t>Campo</w:t>
-            </w:r>
-          </w:p>
-        </w:tc>
-        <w:tc>
-          <w:tcPr>
-            <w:tcW w:type="dxa" w:w="6803"/>
-          </w:tcPr>
-          <w:p>
-            <w:r/>
-            <w:r>
-              <w:rPr>
-                <w:b/>
-                <w:sz w:val="18"/>
-              </w:rPr>
-              <w:t>Valor</w:t>
-            </w:r>
-          </w:p>
-        </w:tc>
-      </w:tr>
-      <w:tr>
-        <w:tc>
-          <w:tcPr>
-            <w:tcW w:type="dxa" w:w="2268"/>
-          </w:tcPr>
-          <w:p>
-            <w:r/>
-            <w:r>
-              <w:rPr>
-                <w:sz w:val="18"/>
-              </w:rPr>
-              <w:t>Programa</w:t>
-            </w:r>
-          </w:p>
-        </w:tc>
-        <w:tc>
-          <w:tcPr>
-            <w:tcW w:type="dxa" w:w="6803"/>
-          </w:tcPr>
-          <w:p>
-            <w:r/>
-            <w:r>
-              <w:rPr>
-                <w:sz w:val="18"/>
-              </w:rPr>
-              <w:t>Análisis y Desarrollo de Software (ADSO)</w:t>
-            </w:r>
-          </w:p>
-        </w:tc>
-      </w:tr>
-      <w:tr>
-        <w:tc>
-          <w:tcPr>
-            <w:tcW w:type="dxa" w:w="2268"/>
-          </w:tcPr>
-          <w:p>
-            <w:r/>
-            <w:r>
-              <w:rPr>
-                <w:sz w:val="18"/>
-              </w:rPr>
-              <w:t>Aprendiz</w:t>
-            </w:r>
-          </w:p>
-        </w:tc>
-        <w:tc>
-          <w:tcPr>
-            <w:tcW w:type="dxa" w:w="6803"/>
-          </w:tcPr>
-          <w:p>
-            <w:r/>
-            <w:r>
-              <w:rPr>
-                <w:sz w:val="18"/>
-              </w:rPr>
-              <w:t>[NOMBRE DEL APRENDIZ]</w:t>
-            </w:r>
-          </w:p>
-        </w:tc>
-      </w:tr>
-      <w:tr>
-        <w:tc>
-          <w:tcPr>
-            <w:tcW w:type="dxa" w:w="2268"/>
-          </w:tcPr>
-          <w:p>
-            <w:r/>
-            <w:r>
-              <w:rPr>
-                <w:sz w:val="18"/>
-              </w:rPr>
-              <w:t>Ficha</w:t>
-            </w:r>
-          </w:p>
-        </w:tc>
-        <w:tc>
-          <w:tcPr>
-            <w:tcW w:type="dxa" w:w="6803"/>
-          </w:tcPr>
-          <w:p>
-            <w:r/>
-            <w:r>
-              <w:rPr>
-                <w:sz w:val="18"/>
-              </w:rPr>
-              <w:t>3235904</w:t>
-            </w:r>
-          </w:p>
-        </w:tc>
-      </w:tr>
-      <w:tr>
-        <w:tc>
-          <w:tcPr>
-            <w:tcW w:type="dxa" w:w="2268"/>
-          </w:tcPr>
-          <w:p>
-            <w:r/>
-            <w:r>
-              <w:rPr>
-                <w:sz w:val="18"/>
-              </w:rPr>
-              <w:t>Instructor técnico</w:t>
-            </w:r>
-          </w:p>
-        </w:tc>
-        <w:tc>
-          <w:tcPr>
-            <w:tcW w:type="dxa" w:w="6803"/>
-          </w:tcPr>
-          <w:p>
-            <w:r/>
-            <w:r>
-              <w:rPr>
-                <w:sz w:val="18"/>
-              </w:rPr>
-              <w:t>Carlos Alberto Fuel Tulcán</w:t>
-            </w:r>
-          </w:p>
-        </w:tc>
-      </w:tr>
-      <w:tr>
-        <w:tc>
-          <w:tcPr>
-            <w:tcW w:type="dxa" w:w="2268"/>
-          </w:tcPr>
-          <w:p>
-            <w:r/>
-            <w:r>
-              <w:rPr>
-                <w:sz w:val="18"/>
-              </w:rPr>
-              <w:t>Fecha de entrega</w:t>
-            </w:r>
-          </w:p>
-        </w:tc>
-        <w:tc>
-          <w:tcPr>
-            <w:tcW w:type="dxa" w:w="6803"/>
-          </w:tcPr>
-          <w:p>
-            <w:r/>
-            <w:r>
-              <w:rPr>
-                <w:sz w:val="18"/>
-              </w:rPr>
-              <w:t>08 de septiembre de 2026</w:t>
-            </w:r>
-          </w:p>
-        </w:tc>
-      </w:tr>
-      <w:tr>
-        <w:tc>
-          <w:tcPr>
-            <w:tcW w:type="dxa" w:w="2268"/>
-          </w:tcPr>
-          <w:p>
-            <w:r/>
-            <w:r>
-              <w:rPr>
-                <w:sz w:val="18"/>
-              </w:rPr>
-              <w:t>Repositorio</w:t>
-            </w:r>
-          </w:p>
-        </w:tc>
-        <w:tc>
-          <w:tcPr>
-            <w:tcW w:type="dxa" w:w="6803"/>
-          </w:tcPr>
-          <w:p>
-            <w:r/>
-            <w:r>
-              <w:rPr>
-                <w:sz w:val="18"/>
-              </w:rPr>
-              <w:t>https://github.com/Zultes-Dev/InvenXis</w:t>
-            </w:r>
-          </w:p>
-        </w:tc>
-      </w:tr>
-      <w:tr>
-        <w:tc>
-          <w:tcPr>
-            <w:tcW w:type="dxa" w:w="2268"/>
-          </w:tcPr>
-          <w:p>
-            <w:r/>
-            <w:r>
-              <w:rPr>
-                <w:sz w:val="18"/>
-              </w:rPr>
-              <w:t>Versión</w:t>
-            </w:r>
-          </w:p>
-        </w:tc>
-        <w:tc>
-          <w:tcPr>
-            <w:tcW w:type="dxa" w:w="6803"/>
-          </w:tcPr>
-          <w:p>
-            <w:r/>
-            <w:r>
-              <w:rPr>
-                <w:sz w:val="18"/>
-              </w:rPr>
-              <w:t>1.0</w:t>
-            </w:r>
-          </w:p>
-        </w:tc>
-      </w:tr>
-    </w:tbl>
-    <w:p/>
     <w:p>
+      <w:pPr>
+        <w:jc w:val="center"/>
+      </w:pPr>
       <w:r>
-        <w:t>Documento único de entrega: reúne los 5 ítems del instrumento de evaluación (módulos documentados, documento técnico, ambiente, control de versiones, acta de pruebas y aceptación) más manual de usuario y anexos. Se entrega en Zajuna junto con el enlace al repositorio.</w:t>
+        <w:rPr>
+          <w:b/>
+        </w:rPr>
+        <w:t>Ficha: 3235904</w:t>
+      </w:r>
+    </w:p>
+    <w:p>
+      <w:pPr>
+        <w:jc w:val="center"/>
+      </w:pPr>
+      <w:r>
+        <w:rPr>
+          <w:b/>
+        </w:rPr>
+        <w:t>Ciudad: Pereira, Risaralda</w:t>
+      </w:r>
+    </w:p>
+    <w:p>
+      <w:pPr>
+        <w:jc w:val="center"/>
+      </w:pPr>
+      <w:r>
+        <w:rPr>
+          <w:b/>
+        </w:rPr>
+        <w:t>Instructor: Carlos Alberto Fuel Tulcán</w:t>
+      </w:r>
+    </w:p>
+    <w:p>
+      <w:pPr>
+        <w:jc w:val="center"/>
+      </w:pPr>
+      <w:r>
+        <w:rPr>
+          <w:b/>
+        </w:rPr>
+        <w:t>Fecha de entrega: 08 de agosto de 2026</w:t>
       </w:r>
     </w:p>
     <w:p>
@@ -307,51 +101,27 @@
       </w:r>
     </w:p>
     <w:p>
-      <w:pPr>
-        <w:pStyle w:val="ListNumber"/>
-      </w:pPr>
       <w:r>
-        <w:t>Módulos codificados y documentados (ítem 1)</w:t>
+        <w:fldChar w:fldCharType="begin"/>
+      </w:r>
+      <w:r>
+        <w:instrText xml:space="preserve">TOC \o "1-1" \h \z \u</w:instrText>
+      </w:r>
+      <w:r>
+        <w:fldChar w:fldCharType="end"/>
       </w:r>
     </w:p>
     <w:p>
-      <w:pPr>
-        <w:pStyle w:val="ListNumber"/>
-      </w:pPr>
       <w:r>
-        <w:t>Documento técnico del sistema (ítem 2)</w:t>
+        <w:rPr>
+          <w:sz w:val="16"/>
+        </w:rPr>
+        <w:t>Nota: clic derecho sobre el índice → Actualizar campo para ver los números de página.</w:t>
       </w:r>
     </w:p>
     <w:p>
-      <w:pPr>
-        <w:pStyle w:val="ListNumber"/>
-      </w:pPr>
       <w:r>
-        <w:t>Ambiente de desarrollo y pruebas (ítem 3)</w:t>
-      </w:r>
-    </w:p>
-    <w:p>
-      <w:pPr>
-        <w:pStyle w:val="ListNumber"/>
-      </w:pPr>
-      <w:r>
-        <w:t>Código por control de versiones (ítem 4)</w:t>
-      </w:r>
-    </w:p>
-    <w:p>
-      <w:pPr>
-        <w:pStyle w:val="ListNumber"/>
-      </w:pPr>
-      <w:r>
-        <w:t>Acta de pruebas y aceptación (ítem 5)</w:t>
-      </w:r>
-    </w:p>
-    <w:p>
-      <w:pPr>
-        <w:pStyle w:val="ListNumber"/>
-      </w:pPr>
-      <w:r>
-        <w:t>Anexos</w:t>
+        <w:br w:type="page"/>
       </w:r>
     </w:p>
     <w:p>
@@ -362,12 +132,832 @@
         <w:rPr>
           <w:color w:val="00843D"/>
         </w:rPr>
-        <w:t>1. Módulos codificados y documentados (ítem 1)</w:t>
+        <w:t>1. Introducción</w:t>
       </w:r>
     </w:p>
     <w:p>
       <w:r>
-        <w:t>API base /api/ con envelope {"success": true, "data": ...} y JWT Bearer.</w:t>
+        <w:t>Este documento presenta la entrega de la evidencia GA8-220501096-AA1-EV02: Módulos integrados, correspondiente al proyecto InvenXis. La evidencia es de producto: no busca mostrar de nuevo el proceso de codificación, sino entregar el sistema con sus módulos ya integrados, documentados y probados.</w:t>
+      </w:r>
+    </w:p>
+    <w:p>
+      <w:r>
+        <w:t>El criterio con el que se evalúa es: “Integra los módulos del software de acuerdo con los propósitos del sistema”. InvenXis lo cumple integrando ocho módulos funcionales en un mismo sistema API-first, de modo que una venta descuenta inventario, genera factura con IVA y puede emitirse electrónicamente.</w:t>
+      </w:r>
+    </w:p>
+    <w:p>
+      <w:r>
+        <w:t>La entrega se organiza según los cinco ítems del instrumento de evaluación (IE-GA8-220501096-AA1-EV02), más acta de aceptación y anexos.</w:t>
+      </w:r>
+    </w:p>
+    <w:p>
+      <w:pPr>
+        <w:pStyle w:val="Heading1"/>
+      </w:pPr>
+      <w:r>
+        <w:rPr>
+          <w:color w:val="00843D"/>
+        </w:rPr>
+        <w:t>2. Ítem 1 — Módulos codificados y documentados</w:t>
+      </w:r>
+    </w:p>
+    <w:p>
+      <w:r>
+        <w:t>Backend Django (app productos) más SPA React, con ocho módulos funcionales:</w:t>
+      </w:r>
+    </w:p>
+    <w:tbl>
+      <w:tblPr>
+        <w:tblStyle w:val="TableGrid"/>
+        <w:tblW w:type="auto" w:w="0"/>
+        <w:jc w:val="left"/>
+        <w:tblLook w:firstColumn="1" w:firstRow="1" w:lastColumn="0" w:lastRow="0" w:noHBand="0" w:noVBand="1" w:val="04A0"/>
+      </w:tblPr>
+      <w:tblGrid>
+        <w:gridCol w:w="1994"/>
+        <w:gridCol w:w="1994"/>
+        <w:gridCol w:w="1994"/>
+        <w:gridCol w:w="1994"/>
+        <w:gridCol w:w="1994"/>
+      </w:tblGrid>
+      <w:tr>
+        <w:tc>
+          <w:tcPr>
+            <w:tcW w:type="dxa" w:w="1417"/>
+          </w:tcPr>
+          <w:p>
+            <w:r/>
+            <w:r>
+              <w:rPr>
+                <w:b/>
+                <w:sz w:val="18"/>
+              </w:rPr>
+              <w:t>Módulo</w:t>
+            </w:r>
+          </w:p>
+        </w:tc>
+        <w:tc>
+          <w:tcPr>
+            <w:tcW w:type="dxa" w:w="1984"/>
+          </w:tcPr>
+          <w:p>
+            <w:r/>
+            <w:r>
+              <w:rPr>
+                <w:b/>
+                <w:sz w:val="18"/>
+              </w:rPr>
+              <w:t>Responsabilidad</w:t>
+            </w:r>
+          </w:p>
+        </w:tc>
+        <w:tc>
+          <w:tcPr>
+            <w:tcW w:type="dxa" w:w="1701"/>
+          </w:tcPr>
+          <w:p>
+            <w:r/>
+            <w:r>
+              <w:rPr>
+                <w:b/>
+                <w:sz w:val="18"/>
+              </w:rPr>
+              <w:t>Entrada</w:t>
+            </w:r>
+          </w:p>
+        </w:tc>
+        <w:tc>
+          <w:tcPr>
+            <w:tcW w:type="dxa" w:w="1701"/>
+          </w:tcPr>
+          <w:p>
+            <w:r/>
+            <w:r>
+              <w:rPr>
+                <w:b/>
+                <w:sz w:val="18"/>
+              </w:rPr>
+              <w:t>Salida</w:t>
+            </w:r>
+          </w:p>
+        </w:tc>
+        <w:tc>
+          <w:tcPr>
+            <w:tcW w:type="dxa" w:w="1701"/>
+          </w:tcPr>
+          <w:p>
+            <w:r/>
+            <w:r>
+              <w:rPr>
+                <w:b/>
+                <w:sz w:val="18"/>
+              </w:rPr>
+              <w:t>Se conecta con</w:t>
+            </w:r>
+          </w:p>
+        </w:tc>
+      </w:tr>
+      <w:tr>
+        <w:tc>
+          <w:tcPr>
+            <w:tcW w:type="dxa" w:w="1417"/>
+          </w:tcPr>
+          <w:p>
+            <w:r/>
+            <w:r>
+              <w:rPr>
+                <w:sz w:val="18"/>
+              </w:rPr>
+              <w:t>Autenticación</w:t>
+            </w:r>
+          </w:p>
+        </w:tc>
+        <w:tc>
+          <w:tcPr>
+            <w:tcW w:type="dxa" w:w="1984"/>
+          </w:tcPr>
+          <w:p>
+            <w:r/>
+            <w:r>
+              <w:rPr>
+                <w:sz w:val="18"/>
+              </w:rPr>
+              <w:t>Sesión y permisos</w:t>
+            </w:r>
+          </w:p>
+        </w:tc>
+        <w:tc>
+          <w:tcPr>
+            <w:tcW w:type="dxa" w:w="1701"/>
+          </w:tcPr>
+          <w:p>
+            <w:r/>
+            <w:r>
+              <w:rPr>
+                <w:sz w:val="18"/>
+              </w:rPr>
+              <w:t>usuario + clave</w:t>
+            </w:r>
+          </w:p>
+        </w:tc>
+        <w:tc>
+          <w:tcPr>
+            <w:tcW w:type="dxa" w:w="1701"/>
+          </w:tcPr>
+          <w:p>
+            <w:r/>
+            <w:r>
+              <w:rPr>
+                <w:sz w:val="18"/>
+              </w:rPr>
+              <w:t>JWT + sesión</w:t>
+            </w:r>
+          </w:p>
+        </w:tc>
+        <w:tc>
+          <w:tcPr>
+            <w:tcW w:type="dxa" w:w="1701"/>
+          </w:tcPr>
+          <w:p>
+            <w:r/>
+            <w:r>
+              <w:rPr>
+                <w:sz w:val="18"/>
+              </w:rPr>
+              <w:t>Ventas, Facturación, Admin</w:t>
+            </w:r>
+          </w:p>
+        </w:tc>
+      </w:tr>
+      <w:tr>
+        <w:tc>
+          <w:tcPr>
+            <w:tcW w:type="dxa" w:w="1417"/>
+          </w:tcPr>
+          <w:p>
+            <w:r/>
+            <w:r>
+              <w:rPr>
+                <w:sz w:val="18"/>
+              </w:rPr>
+              <w:t>Productos</w:t>
+            </w:r>
+          </w:p>
+        </w:tc>
+        <w:tc>
+          <w:tcPr>
+            <w:tcW w:type="dxa" w:w="1984"/>
+          </w:tcPr>
+          <w:p>
+            <w:r/>
+            <w:r>
+              <w:rPr>
+                <w:sz w:val="18"/>
+              </w:rPr>
+              <w:t>Inventario</w:t>
+            </w:r>
+          </w:p>
+        </w:tc>
+        <w:tc>
+          <w:tcPr>
+            <w:tcW w:type="dxa" w:w="1701"/>
+          </w:tcPr>
+          <w:p>
+            <w:r/>
+            <w:r>
+              <w:rPr>
+                <w:sz w:val="18"/>
+              </w:rPr>
+              <w:t>nombre, precio, stock</w:t>
+            </w:r>
+          </w:p>
+        </w:tc>
+        <w:tc>
+          <w:tcPr>
+            <w:tcW w:type="dxa" w:w="1701"/>
+          </w:tcPr>
+          <w:p>
+            <w:r/>
+            <w:r>
+              <w:rPr>
+                <w:sz w:val="18"/>
+              </w:rPr>
+              <w:t>Producto disponible</w:t>
+            </w:r>
+          </w:p>
+        </w:tc>
+        <w:tc>
+          <w:tcPr>
+            <w:tcW w:type="dxa" w:w="1701"/>
+          </w:tcPr>
+          <w:p>
+            <w:r/>
+            <w:r>
+              <w:rPr>
+                <w:sz w:val="18"/>
+              </w:rPr>
+              <w:t>Ventas, Pedidos</w:t>
+            </w:r>
+          </w:p>
+        </w:tc>
+      </w:tr>
+      <w:tr>
+        <w:tc>
+          <w:tcPr>
+            <w:tcW w:type="dxa" w:w="1417"/>
+          </w:tcPr>
+          <w:p>
+            <w:r/>
+            <w:r>
+              <w:rPr>
+                <w:sz w:val="18"/>
+              </w:rPr>
+              <w:t>Proveedores</w:t>
+            </w:r>
+          </w:p>
+        </w:tc>
+        <w:tc>
+          <w:tcPr>
+            <w:tcW w:type="dxa" w:w="1984"/>
+          </w:tcPr>
+          <w:p>
+            <w:r/>
+            <w:r>
+              <w:rPr>
+                <w:sz w:val="18"/>
+              </w:rPr>
+              <w:t>Aliados e historial</w:t>
+            </w:r>
+          </w:p>
+        </w:tc>
+        <w:tc>
+          <w:tcPr>
+            <w:tcW w:type="dxa" w:w="1701"/>
+          </w:tcPr>
+          <w:p>
+            <w:r/>
+            <w:r>
+              <w:rPr>
+                <w:sz w:val="18"/>
+              </w:rPr>
+              <w:t>razón social, NIT</w:t>
+            </w:r>
+          </w:p>
+        </w:tc>
+        <w:tc>
+          <w:tcPr>
+            <w:tcW w:type="dxa" w:w="1701"/>
+          </w:tcPr>
+          <w:p>
+            <w:r/>
+            <w:r>
+              <w:rPr>
+                <w:sz w:val="18"/>
+              </w:rPr>
+              <w:t>Proveedor con pedidos</w:t>
+            </w:r>
+          </w:p>
+        </w:tc>
+        <w:tc>
+          <w:tcPr>
+            <w:tcW w:type="dxa" w:w="1701"/>
+          </w:tcPr>
+          <w:p>
+            <w:r/>
+            <w:r>
+              <w:rPr>
+                <w:sz w:val="18"/>
+              </w:rPr>
+              <w:t>Productos, Pedidos</w:t>
+            </w:r>
+          </w:p>
+        </w:tc>
+      </w:tr>
+      <w:tr>
+        <w:tc>
+          <w:tcPr>
+            <w:tcW w:type="dxa" w:w="1417"/>
+          </w:tcPr>
+          <w:p>
+            <w:r/>
+            <w:r>
+              <w:rPr>
+                <w:sz w:val="18"/>
+              </w:rPr>
+              <w:t>Pedidos</w:t>
+            </w:r>
+          </w:p>
+        </w:tc>
+        <w:tc>
+          <w:tcPr>
+            <w:tcW w:type="dxa" w:w="1984"/>
+          </w:tcPr>
+          <w:p>
+            <w:r/>
+            <w:r>
+              <w:rPr>
+                <w:sz w:val="18"/>
+              </w:rPr>
+              <w:t>Pedidos que integran</w:t>
+            </w:r>
+          </w:p>
+        </w:tc>
+        <w:tc>
+          <w:tcPr>
+            <w:tcW w:type="dxa" w:w="1701"/>
+          </w:tcPr>
+          <w:p>
+            <w:r/>
+            <w:r>
+              <w:rPr>
+                <w:sz w:val="18"/>
+              </w:rPr>
+              <w:t>proveedor, productos</w:t>
+            </w:r>
+          </w:p>
+        </w:tc>
+        <w:tc>
+          <w:tcPr>
+            <w:tcW w:type="dxa" w:w="1701"/>
+          </w:tcPr>
+          <w:p>
+            <w:r/>
+            <w:r>
+              <w:rPr>
+                <w:sz w:val="18"/>
+              </w:rPr>
+              <w:t>Pedido con total</w:t>
+            </w:r>
+          </w:p>
+        </w:tc>
+        <w:tc>
+          <w:tcPr>
+            <w:tcW w:type="dxa" w:w="1701"/>
+          </w:tcPr>
+          <w:p>
+            <w:r/>
+            <w:r>
+              <w:rPr>
+                <w:sz w:val="18"/>
+              </w:rPr>
+              <w:t>Proveedores, Productos</w:t>
+            </w:r>
+          </w:p>
+        </w:tc>
+      </w:tr>
+      <w:tr>
+        <w:tc>
+          <w:tcPr>
+            <w:tcW w:type="dxa" w:w="1417"/>
+          </w:tcPr>
+          <w:p>
+            <w:r/>
+            <w:r>
+              <w:rPr>
+                <w:sz w:val="18"/>
+              </w:rPr>
+              <w:t>Ventas</w:t>
+            </w:r>
+          </w:p>
+        </w:tc>
+        <w:tc>
+          <w:tcPr>
+            <w:tcW w:type="dxa" w:w="1984"/>
+          </w:tcPr>
+          <w:p>
+            <w:r/>
+            <w:r>
+              <w:rPr>
+                <w:sz w:val="18"/>
+              </w:rPr>
+              <w:t>Punto de venta atómico</w:t>
+            </w:r>
+          </w:p>
+        </w:tc>
+        <w:tc>
+          <w:tcPr>
+            <w:tcW w:type="dxa" w:w="1701"/>
+          </w:tcPr>
+          <w:p>
+            <w:r/>
+            <w:r>
+              <w:rPr>
+                <w:sz w:val="18"/>
+              </w:rPr>
+              <w:t>cliente, líneas</w:t>
+            </w:r>
+          </w:p>
+        </w:tc>
+        <w:tc>
+          <w:tcPr>
+            <w:tcW w:type="dxa" w:w="1701"/>
+          </w:tcPr>
+          <w:p>
+            <w:r/>
+            <w:r>
+              <w:rPr>
+                <w:sz w:val="18"/>
+              </w:rPr>
+              <w:t>Venta + descuento</w:t>
+            </w:r>
+          </w:p>
+        </w:tc>
+        <w:tc>
+          <w:tcPr>
+            <w:tcW w:type="dxa" w:w="1701"/>
+          </w:tcPr>
+          <w:p>
+            <w:r/>
+            <w:r>
+              <w:rPr>
+                <w:sz w:val="18"/>
+              </w:rPr>
+              <w:t>Productos, Facturación</w:t>
+            </w:r>
+          </w:p>
+        </w:tc>
+      </w:tr>
+      <w:tr>
+        <w:tc>
+          <w:tcPr>
+            <w:tcW w:type="dxa" w:w="1417"/>
+          </w:tcPr>
+          <w:p>
+            <w:r/>
+            <w:r>
+              <w:rPr>
+                <w:sz w:val="18"/>
+              </w:rPr>
+              <w:t>Facturación FE</w:t>
+            </w:r>
+          </w:p>
+        </w:tc>
+        <w:tc>
+          <w:tcPr>
+            <w:tcW w:type="dxa" w:w="1984"/>
+          </w:tcPr>
+          <w:p>
+            <w:r/>
+            <w:r>
+              <w:rPr>
+                <w:sz w:val="18"/>
+              </w:rPr>
+              <w:t>Facturar/emitir/anular</w:t>
+            </w:r>
+          </w:p>
+        </w:tc>
+        <w:tc>
+          <w:tcPr>
+            <w:tcW w:type="dxa" w:w="1701"/>
+          </w:tcPr>
+          <w:p>
+            <w:r/>
+            <w:r>
+              <w:rPr>
+                <w:sz w:val="18"/>
+              </w:rPr>
+              <w:t>venta + NIT</w:t>
+            </w:r>
+          </w:p>
+        </w:tc>
+        <w:tc>
+          <w:tcPr>
+            <w:tcW w:type="dxa" w:w="1701"/>
+          </w:tcPr>
+          <w:p>
+            <w:r/>
+            <w:r>
+              <w:rPr>
+                <w:sz w:val="18"/>
+              </w:rPr>
+              <w:t>Factura, CUFE, UBL, PDF</w:t>
+            </w:r>
+          </w:p>
+        </w:tc>
+        <w:tc>
+          <w:tcPr>
+            <w:tcW w:type="dxa" w:w="1701"/>
+          </w:tcPr>
+          <w:p>
+            <w:r/>
+            <w:r>
+              <w:rPr>
+                <w:sz w:val="18"/>
+              </w:rPr>
+              <w:t>Ventas</w:t>
+            </w:r>
+          </w:p>
+        </w:tc>
+      </w:tr>
+      <w:tr>
+        <w:tc>
+          <w:tcPr>
+            <w:tcW w:type="dxa" w:w="1417"/>
+          </w:tcPr>
+          <w:p>
+            <w:r/>
+            <w:r>
+              <w:rPr>
+                <w:sz w:val="18"/>
+              </w:rPr>
+              <w:t>Dashboard</w:t>
+            </w:r>
+          </w:p>
+        </w:tc>
+        <w:tc>
+          <w:tcPr>
+            <w:tcW w:type="dxa" w:w="1984"/>
+          </w:tcPr>
+          <w:p>
+            <w:r/>
+            <w:r>
+              <w:rPr>
+                <w:sz w:val="18"/>
+              </w:rPr>
+              <w:t>KPIs y recientes</w:t>
+            </w:r>
+          </w:p>
+        </w:tc>
+        <w:tc>
+          <w:tcPr>
+            <w:tcW w:type="dxa" w:w="1701"/>
+          </w:tcPr>
+          <w:p>
+            <w:r/>
+            <w:r>
+              <w:rPr>
+                <w:sz w:val="18"/>
+              </w:rPr>
+              <w:t>—</w:t>
+            </w:r>
+          </w:p>
+        </w:tc>
+        <w:tc>
+          <w:tcPr>
+            <w:tcW w:type="dxa" w:w="1701"/>
+          </w:tcPr>
+          <w:p>
+            <w:r/>
+            <w:r>
+              <w:rPr>
+                <w:sz w:val="18"/>
+              </w:rPr>
+              <w:t>Panel con indicadores</w:t>
+            </w:r>
+          </w:p>
+        </w:tc>
+        <w:tc>
+          <w:tcPr>
+            <w:tcW w:type="dxa" w:w="1701"/>
+          </w:tcPr>
+          <w:p>
+            <w:r/>
+            <w:r>
+              <w:rPr>
+                <w:sz w:val="18"/>
+              </w:rPr>
+              <w:t>Todos</w:t>
+            </w:r>
+          </w:p>
+        </w:tc>
+      </w:tr>
+      <w:tr>
+        <w:tc>
+          <w:tcPr>
+            <w:tcW w:type="dxa" w:w="1417"/>
+          </w:tcPr>
+          <w:p>
+            <w:r/>
+            <w:r>
+              <w:rPr>
+                <w:sz w:val="18"/>
+              </w:rPr>
+              <w:t>Reportes</w:t>
+            </w:r>
+          </w:p>
+        </w:tc>
+        <w:tc>
+          <w:tcPr>
+            <w:tcW w:type="dxa" w:w="1984"/>
+          </w:tcPr>
+          <w:p>
+            <w:r/>
+            <w:r>
+              <w:rPr>
+                <w:sz w:val="18"/>
+              </w:rPr>
+              <w:t>Analítica y exports</w:t>
+            </w:r>
+          </w:p>
+        </w:tc>
+        <w:tc>
+          <w:tcPr>
+            <w:tcW w:type="dxa" w:w="1701"/>
+          </w:tcPr>
+          <w:p>
+            <w:r/>
+            <w:r>
+              <w:rPr>
+                <w:sz w:val="18"/>
+              </w:rPr>
+              <w:t>filtros + formato</w:t>
+            </w:r>
+          </w:p>
+        </w:tc>
+        <w:tc>
+          <w:tcPr>
+            <w:tcW w:type="dxa" w:w="1701"/>
+          </w:tcPr>
+          <w:p>
+            <w:r/>
+            <w:r>
+              <w:rPr>
+                <w:sz w:val="18"/>
+              </w:rPr>
+              <w:t>Excel/PDF</w:t>
+            </w:r>
+          </w:p>
+        </w:tc>
+        <w:tc>
+          <w:tcPr>
+            <w:tcW w:type="dxa" w:w="1701"/>
+          </w:tcPr>
+          <w:p>
+            <w:r/>
+            <w:r>
+              <w:rPr>
+                <w:sz w:val="18"/>
+              </w:rPr>
+              <w:t>Ventas, Productos</w:t>
+            </w:r>
+          </w:p>
+        </w:tc>
+      </w:tr>
+    </w:tbl>
+    <w:p/>
+    <w:p>
+      <w:r>
+        <w:rPr>
+          <w:b/>
+        </w:rPr>
+        <w:t>Punto de integración. La venta integra a los demás (descuento atómico de stock):</w:t>
+      </w:r>
+    </w:p>
+    <w:p>
+      <w:r>
+        <w:rPr>
+          <w:rFonts w:ascii="Courier New" w:hAnsi="Courier New"/>
+          <w:sz w:val="16"/>
+        </w:rPr>
+        <w:t># productos/serializers.py</w:t>
+      </w:r>
+    </w:p>
+    <w:p>
+      <w:r>
+        <w:rPr>
+          <w:rFonts w:ascii="Courier New" w:hAnsi="Courier New"/>
+          <w:sz w:val="16"/>
+        </w:rPr>
+        <w:t>with transaction.atomic():</w:t>
+      </w:r>
+    </w:p>
+    <w:p>
+      <w:r>
+        <w:rPr>
+          <w:rFonts w:ascii="Courier New" w:hAnsi="Courier New"/>
+          <w:sz w:val="16"/>
+        </w:rPr>
+        <w:t xml:space="preserve">    producto = Producto.objects.select_for_update().get(pk=...)</w:t>
+      </w:r>
+    </w:p>
+    <w:p>
+      <w:r>
+        <w:rPr>
+          <w:rFonts w:ascii="Courier New" w:hAnsi="Courier New"/>
+          <w:sz w:val="16"/>
+        </w:rPr>
+        <w:t xml:space="preserve">    if producto.cantidad &lt; cantidad:</w:t>
+      </w:r>
+    </w:p>
+    <w:p>
+      <w:r>
+        <w:rPr>
+          <w:rFonts w:ascii="Courier New" w:hAnsi="Courier New"/>
+          <w:sz w:val="16"/>
+        </w:rPr>
+        <w:t xml:space="preserve">        raise serializers.ValidationError({'detalles': 'Stock insuficiente...'})</w:t>
+      </w:r>
+    </w:p>
+    <w:p/>
+    <w:p>
+      <w:r>
+        <w:rPr>
+          <w:b/>
+        </w:rPr>
+        <w:t>Integración validada por regla de negocio (CUFE estilo DIAN):</w:t>
+      </w:r>
+    </w:p>
+    <w:p>
+      <w:r>
+        <w:rPr>
+          <w:rFonts w:ascii="Courier New" w:hAnsi="Courier New"/>
+          <w:sz w:val="16"/>
+        </w:rPr>
+        <w:t># productos/fe/cufe.py</w:t>
+      </w:r>
+    </w:p>
+    <w:p>
+      <w:r>
+        <w:rPr>
+          <w:rFonts w:ascii="Courier New" w:hAnsi="Courier New"/>
+          <w:sz w:val="16"/>
+        </w:rPr>
+        <w:t>base = (f"{numero}{fecha}{nit_emisor}{doc_adquiriente}"</w:t>
+      </w:r>
+    </w:p>
+    <w:p>
+      <w:r>
+        <w:rPr>
+          <w:rFonts w:ascii="Courier New" w:hAnsi="Courier New"/>
+          <w:sz w:val="16"/>
+        </w:rPr>
+        <w:t xml:space="preserve">        f"{total}{iva}01{iva}{clave_tecnica}")</w:t>
+      </w:r>
+    </w:p>
+    <w:p>
+      <w:r>
+        <w:rPr>
+          <w:rFonts w:ascii="Courier New" w:hAnsi="Courier New"/>
+          <w:sz w:val="16"/>
+        </w:rPr>
+        <w:t>return hashlib.sha384(base.encode('utf-8')).hexdigest()</w:t>
+      </w:r>
+    </w:p>
+    <w:p/>
+    <w:p>
+      <w:pPr>
+        <w:pStyle w:val="Heading1"/>
+      </w:pPr>
+      <w:r>
+        <w:rPr>
+          <w:color w:val="00843D"/>
+        </w:rPr>
+        <w:t>3. Ítem 2 — Documento técnico del sistema</w:t>
+      </w:r>
+    </w:p>
+    <w:p>
+      <w:r>
+        <w:t>Descripción general. InvenXis gestiona inventario, proveedores, pedidos, ventas con descuento automático y facturación electrónica (CUFE + UBL 2.1, IVA 19%, notas crédito).</w:t>
+      </w:r>
+    </w:p>
+    <w:p>
+      <w:r>
+        <w:t>Arquitectura. API-first sobre MVT: Petición → config/urls.py → productos/urls_api.py → APIView/serializers → ORM → JSON → TanStack Query → React.</w:t>
+      </w:r>
+    </w:p>
+    <w:p>
+      <w:r>
+        <w:t>Modelo de datos. Proveedor 1—N Producto/Pedido; Pedido/Venta 1—N Detalles; Venta 1—1 Factura 1—N NotaCredito; User/Group para RBAC. (Anexo A: ER.)</w:t>
       </w:r>
     </w:p>
     <w:p>
@@ -378,7 +968,7 @@
         <w:rPr>
           <w:color w:val="00843D"/>
         </w:rPr>
-        <w:t>Autenticación y autorización</w:t>
+        <w:t>Tecnologías utilizadas (verificadas)</w:t>
       </w:r>
     </w:p>
     <w:tbl>
@@ -395,7 +985,7 @@
       <w:tr>
         <w:tc>
           <w:tcPr>
-            <w:tcW w:type="dxa" w:w="1984"/>
+            <w:tcW w:type="dxa" w:w="2835"/>
           </w:tcPr>
           <w:p>
             <w:r/>
@@ -404,13 +994,13 @@
                 <w:b/>
                 <w:sz w:val="18"/>
               </w:rPr>
-              <w:t>Aspecto</w:t>
+              <w:t>Componente</w:t>
             </w:r>
           </w:p>
         </w:tc>
         <w:tc>
           <w:tcPr>
-            <w:tcW w:type="dxa" w:w="7087"/>
+            <w:tcW w:type="dxa" w:w="6236"/>
           </w:tcPr>
           <w:p>
             <w:r/>
@@ -419,7 +1009,7 @@
                 <w:b/>
                 <w:sz w:val="18"/>
               </w:rPr>
-              <w:t>Detalle</w:t>
+              <w:t>Tecnología</w:t>
             </w:r>
           </w:p>
         </w:tc>
@@ -427,7 +1017,7 @@
       <w:tr>
         <w:tc>
           <w:tcPr>
-            <w:tcW w:type="dxa" w:w="1984"/>
+            <w:tcW w:type="dxa" w:w="2835"/>
           </w:tcPr>
           <w:p>
             <w:r/>
@@ -435,13 +1025,13 @@
               <w:rPr>
                 <w:sz w:val="18"/>
               </w:rPr>
-              <w:t>Entradas</w:t>
+              <w:t>Lenguaje</w:t>
             </w:r>
           </w:p>
         </w:tc>
         <w:tc>
           <w:tcPr>
-            <w:tcW w:type="dxa" w:w="7087"/>
+            <w:tcW w:type="dxa" w:w="6236"/>
           </w:tcPr>
           <w:p>
             <w:r/>
@@ -449,7 +1039,7 @@
               <w:rPr>
                 <w:sz w:val="18"/>
               </w:rPr>
-              <w:t>POST /api/auth/login/, /api/auth/refresh/, /api/auth/logout/, GET /api/auth/me/</w:t>
+              <w:t>Python 3.13.7</w:t>
             </w:r>
           </w:p>
         </w:tc>
@@ -457,7 +1047,7 @@
       <w:tr>
         <w:tc>
           <w:tcPr>
-            <w:tcW w:type="dxa" w:w="1984"/>
+            <w:tcW w:type="dxa" w:w="2835"/>
           </w:tcPr>
           <w:p>
             <w:r/>
@@ -465,13 +1055,13 @@
               <w:rPr>
                 <w:sz w:val="18"/>
               </w:rPr>
-              <w:t>Salidas / comportamiento</w:t>
+              <w:t>Framework</w:t>
             </w:r>
           </w:p>
         </w:tc>
         <w:tc>
           <w:tcPr>
-            <w:tcW w:type="dxa" w:w="7087"/>
+            <w:tcW w:type="dxa" w:w="6236"/>
           </w:tcPr>
           <w:p>
             <w:r/>
@@ -479,7 +1069,7 @@
               <w:rPr>
                 <w:sz w:val="18"/>
               </w:rPr>
-              <w:t>JWT access+refresh con rotación y blacklist; throttle de login 20/min; RBAC por grupos.</w:t>
+              <w:t>Django 6.0.7 (API-first sobre MVT)</w:t>
             </w:r>
           </w:p>
         </w:tc>
@@ -487,7 +1077,7 @@
       <w:tr>
         <w:tc>
           <w:tcPr>
-            <w:tcW w:type="dxa" w:w="1984"/>
+            <w:tcW w:type="dxa" w:w="2835"/>
           </w:tcPr>
           <w:p>
             <w:r/>
@@ -495,13 +1085,13 @@
               <w:rPr>
                 <w:sz w:val="18"/>
               </w:rPr>
-              <w:t>Código</w:t>
+              <w:t>API</w:t>
             </w:r>
           </w:p>
         </w:tc>
         <w:tc>
           <w:tcPr>
-            <w:tcW w:type="dxa" w:w="7087"/>
+            <w:tcW w:type="dxa" w:w="6236"/>
           </w:tcPr>
           <w:p>
             <w:r/>
@@ -509,7 +1099,157 @@
               <w:rPr>
                 <w:sz w:val="18"/>
               </w:rPr>
-              <w:t>productos/api_views.py, config/settings.py, frontend/src/contexts/AuthContext.tsx</w:t>
+              <w:t>DRF 3.17.1 + SimpleJWT + drf-spectacular</w:t>
+            </w:r>
+          </w:p>
+        </w:tc>
+      </w:tr>
+      <w:tr>
+        <w:tc>
+          <w:tcPr>
+            <w:tcW w:type="dxa" w:w="2835"/>
+          </w:tcPr>
+          <w:p>
+            <w:r/>
+            <w:r>
+              <w:rPr>
+                <w:sz w:val="18"/>
+              </w:rPr>
+              <w:t>Base de datos</w:t>
+            </w:r>
+          </w:p>
+        </w:tc>
+        <w:tc>
+          <w:tcPr>
+            <w:tcW w:type="dxa" w:w="6236"/>
+          </w:tcPr>
+          <w:p>
+            <w:r/>
+            <w:r>
+              <w:rPr>
+                <w:sz w:val="18"/>
+              </w:rPr>
+              <w:t>SQLite (dev) / PostgreSQL 16 (prod)</w:t>
+            </w:r>
+          </w:p>
+        </w:tc>
+      </w:tr>
+      <w:tr>
+        <w:tc>
+          <w:tcPr>
+            <w:tcW w:type="dxa" w:w="2835"/>
+          </w:tcPr>
+          <w:p>
+            <w:r/>
+            <w:r>
+              <w:rPr>
+                <w:sz w:val="18"/>
+              </w:rPr>
+              <w:t>Frontend</w:t>
+            </w:r>
+          </w:p>
+        </w:tc>
+        <w:tc>
+          <w:tcPr>
+            <w:tcW w:type="dxa" w:w="6236"/>
+          </w:tcPr>
+          <w:p>
+            <w:r/>
+            <w:r>
+              <w:rPr>
+                <w:sz w:val="18"/>
+              </w:rPr>
+              <w:t>React 19.2.8 + Vite 8.1.5 + TypeScript 6.0.3 + Tailwind v4</w:t>
+            </w:r>
+          </w:p>
+        </w:tc>
+      </w:tr>
+      <w:tr>
+        <w:tc>
+          <w:tcPr>
+            <w:tcW w:type="dxa" w:w="2835"/>
+          </w:tcPr>
+          <w:p>
+            <w:r/>
+            <w:r>
+              <w:rPr>
+                <w:sz w:val="18"/>
+              </w:rPr>
+              <w:t>Datos</w:t>
+            </w:r>
+          </w:p>
+        </w:tc>
+        <w:tc>
+          <w:tcPr>
+            <w:tcW w:type="dxa" w:w="6236"/>
+          </w:tcPr>
+          <w:p>
+            <w:r/>
+            <w:r>
+              <w:rPr>
+                <w:sz w:val="18"/>
+              </w:rPr>
+              <w:t>Axios + TanStack Query 5</w:t>
+            </w:r>
+          </w:p>
+        </w:tc>
+      </w:tr>
+      <w:tr>
+        <w:tc>
+          <w:tcPr>
+            <w:tcW w:type="dxa" w:w="2835"/>
+          </w:tcPr>
+          <w:p>
+            <w:r/>
+            <w:r>
+              <w:rPr>
+                <w:sz w:val="18"/>
+              </w:rPr>
+              <w:t>Calidad</w:t>
+            </w:r>
+          </w:p>
+        </w:tc>
+        <w:tc>
+          <w:tcPr>
+            <w:tcW w:type="dxa" w:w="6236"/>
+          </w:tcPr>
+          <w:p>
+            <w:r/>
+            <w:r>
+              <w:rPr>
+                <w:sz w:val="18"/>
+              </w:rPr>
+              <w:t>pytest + Playwright + oxlint + tsc</w:t>
+            </w:r>
+          </w:p>
+        </w:tc>
+      </w:tr>
+      <w:tr>
+        <w:tc>
+          <w:tcPr>
+            <w:tcW w:type="dxa" w:w="2835"/>
+          </w:tcPr>
+          <w:p>
+            <w:r/>
+            <w:r>
+              <w:rPr>
+                <w:sz w:val="18"/>
+              </w:rPr>
+              <w:t>Runtime/CI</w:t>
+            </w:r>
+          </w:p>
+        </w:tc>
+        <w:tc>
+          <w:tcPr>
+            <w:tcW w:type="dxa" w:w="6236"/>
+          </w:tcPr>
+          <w:p>
+            <w:r/>
+            <w:r>
+              <w:rPr>
+                <w:sz w:val="18"/>
+              </w:rPr>
+              <w:t>Node 24.16.0 / npm 11.13.0 / GitHub Actions</w:t>
             </w:r>
           </w:p>
         </w:tc>
@@ -517,881 +1257,10 @@
     </w:tbl>
     <w:p/>
     <w:p>
-      <w:pPr>
-        <w:pStyle w:val="Heading2"/>
-      </w:pPr>
       <w:r>
-        <w:rPr>
-          <w:color w:val="00843D"/>
-        </w:rPr>
-        <w:t>Productos e inventario</w:t>
+        <w:t>Hallazgo documentado (pendiente real). La emisión productiva ante la DIAN exige certificado digital y proveedor tecnológico; el sistema incluye mock intercambiable (TC-12).</w:t>
       </w:r>
     </w:p>
-    <w:tbl>
-      <w:tblPr>
-        <w:tblStyle w:val="TableGrid"/>
-        <w:tblW w:type="auto" w:w="0"/>
-        <w:jc w:val="left"/>
-        <w:tblLook w:firstColumn="1" w:firstRow="1" w:lastColumn="0" w:lastRow="0" w:noHBand="0" w:noVBand="1" w:val="04A0"/>
-      </w:tblPr>
-      <w:tblGrid>
-        <w:gridCol w:w="4986"/>
-        <w:gridCol w:w="4986"/>
-      </w:tblGrid>
-      <w:tr>
-        <w:tc>
-          <w:tcPr>
-            <w:tcW w:type="dxa" w:w="1984"/>
-          </w:tcPr>
-          <w:p>
-            <w:r/>
-            <w:r>
-              <w:rPr>
-                <w:b/>
-                <w:sz w:val="18"/>
-              </w:rPr>
-              <w:t>Aspecto</w:t>
-            </w:r>
-          </w:p>
-        </w:tc>
-        <w:tc>
-          <w:tcPr>
-            <w:tcW w:type="dxa" w:w="7087"/>
-          </w:tcPr>
-          <w:p>
-            <w:r/>
-            <w:r>
-              <w:rPr>
-                <w:b/>
-                <w:sz w:val="18"/>
-              </w:rPr>
-              <w:t>Detalle</w:t>
-            </w:r>
-          </w:p>
-        </w:tc>
-      </w:tr>
-      <w:tr>
-        <w:tc>
-          <w:tcPr>
-            <w:tcW w:type="dxa" w:w="1984"/>
-          </w:tcPr>
-          <w:p>
-            <w:r/>
-            <w:r>
-              <w:rPr>
-                <w:sz w:val="18"/>
-              </w:rPr>
-              <w:t>Entradas</w:t>
-            </w:r>
-          </w:p>
-        </w:tc>
-        <w:tc>
-          <w:tcPr>
-            <w:tcW w:type="dxa" w:w="7087"/>
-          </w:tcPr>
-          <w:p>
-            <w:r/>
-            <w:r>
-              <w:rPr>
-                <w:sz w:val="18"/>
-              </w:rPr>
-              <w:t>CRUD /api/productos/ + filtros y paginación</w:t>
-            </w:r>
-          </w:p>
-        </w:tc>
-      </w:tr>
-      <w:tr>
-        <w:tc>
-          <w:tcPr>
-            <w:tcW w:type="dxa" w:w="1984"/>
-          </w:tcPr>
-          <w:p>
-            <w:r/>
-            <w:r>
-              <w:rPr>
-                <w:sz w:val="18"/>
-              </w:rPr>
-              <w:t>Salidas / comportamiento</w:t>
-            </w:r>
-          </w:p>
-        </w:tc>
-        <w:tc>
-          <w:tcPr>
-            <w:tcW w:type="dxa" w:w="7087"/>
-          </w:tcPr>
-          <w:p>
-            <w:r/>
-            <w:r>
-              <w:rPr>
-                <w:sz w:val="18"/>
-              </w:rPr>
-              <w:t>Lee/escribe Producto (nombre, categoría, precio, cantidad, stock_min, proveedor).</w:t>
-            </w:r>
-          </w:p>
-        </w:tc>
-      </w:tr>
-      <w:tr>
-        <w:tc>
-          <w:tcPr>
-            <w:tcW w:type="dxa" w:w="1984"/>
-          </w:tcPr>
-          <w:p>
-            <w:r/>
-            <w:r>
-              <w:rPr>
-                <w:sz w:val="18"/>
-              </w:rPr>
-              <w:t>Código</w:t>
-            </w:r>
-          </w:p>
-        </w:tc>
-        <w:tc>
-          <w:tcPr>
-            <w:tcW w:type="dxa" w:w="7087"/>
-          </w:tcPr>
-          <w:p>
-            <w:r/>
-            <w:r>
-              <w:rPr>
-                <w:sz w:val="18"/>
-              </w:rPr>
-              <w:t>productos/models.py, api_views.py, frontend/src/pages/ProductosPage.tsx</w:t>
-            </w:r>
-          </w:p>
-        </w:tc>
-      </w:tr>
-    </w:tbl>
-    <w:p/>
-    <w:p>
-      <w:pPr>
-        <w:pStyle w:val="Heading2"/>
-      </w:pPr>
-      <w:r>
-        <w:rPr>
-          <w:color w:val="00843D"/>
-        </w:rPr>
-        <w:t>Proveedores y pedidos</w:t>
-      </w:r>
-    </w:p>
-    <w:tbl>
-      <w:tblPr>
-        <w:tblStyle w:val="TableGrid"/>
-        <w:tblW w:type="auto" w:w="0"/>
-        <w:jc w:val="left"/>
-        <w:tblLook w:firstColumn="1" w:firstRow="1" w:lastColumn="0" w:lastRow="0" w:noHBand="0" w:noVBand="1" w:val="04A0"/>
-      </w:tblPr>
-      <w:tblGrid>
-        <w:gridCol w:w="4986"/>
-        <w:gridCol w:w="4986"/>
-      </w:tblGrid>
-      <w:tr>
-        <w:tc>
-          <w:tcPr>
-            <w:tcW w:type="dxa" w:w="1984"/>
-          </w:tcPr>
-          <w:p>
-            <w:r/>
-            <w:r>
-              <w:rPr>
-                <w:b/>
-                <w:sz w:val="18"/>
-              </w:rPr>
-              <w:t>Aspecto</w:t>
-            </w:r>
-          </w:p>
-        </w:tc>
-        <w:tc>
-          <w:tcPr>
-            <w:tcW w:type="dxa" w:w="7087"/>
-          </w:tcPr>
-          <w:p>
-            <w:r/>
-            <w:r>
-              <w:rPr>
-                <w:b/>
-                <w:sz w:val="18"/>
-              </w:rPr>
-              <w:t>Detalle</w:t>
-            </w:r>
-          </w:p>
-        </w:tc>
-      </w:tr>
-      <w:tr>
-        <w:tc>
-          <w:tcPr>
-            <w:tcW w:type="dxa" w:w="1984"/>
-          </w:tcPr>
-          <w:p>
-            <w:r/>
-            <w:r>
-              <w:rPr>
-                <w:sz w:val="18"/>
-              </w:rPr>
-              <w:t>Entradas</w:t>
-            </w:r>
-          </w:p>
-        </w:tc>
-        <w:tc>
-          <w:tcPr>
-            <w:tcW w:type="dxa" w:w="7087"/>
-          </w:tcPr>
-          <w:p>
-            <w:r/>
-            <w:r>
-              <w:rPr>
-                <w:sz w:val="18"/>
-              </w:rPr>
-              <w:t>CRUD /api/proveedores/, /api/proveedores/{id}/pedidos/, /api/pedidos/{id}/</w:t>
-            </w:r>
-          </w:p>
-        </w:tc>
-      </w:tr>
-      <w:tr>
-        <w:tc>
-          <w:tcPr>
-            <w:tcW w:type="dxa" w:w="1984"/>
-          </w:tcPr>
-          <w:p>
-            <w:r/>
-            <w:r>
-              <w:rPr>
-                <w:sz w:val="18"/>
-              </w:rPr>
-              <w:t>Salidas / comportamiento</w:t>
-            </w:r>
-          </w:p>
-        </w:tc>
-        <w:tc>
-          <w:tcPr>
-            <w:tcW w:type="dxa" w:w="7087"/>
-          </w:tcPr>
-          <w:p>
-            <w:r/>
-            <w:r>
-              <w:rPr>
-                <w:sz w:val="18"/>
-              </w:rPr>
-              <w:t>Proveedor con conteos; pedidos con estados.</w:t>
-            </w:r>
-          </w:p>
-        </w:tc>
-      </w:tr>
-      <w:tr>
-        <w:tc>
-          <w:tcPr>
-            <w:tcW w:type="dxa" w:w="1984"/>
-          </w:tcPr>
-          <w:p>
-            <w:r/>
-            <w:r>
-              <w:rPr>
-                <w:sz w:val="18"/>
-              </w:rPr>
-              <w:t>Código</w:t>
-            </w:r>
-          </w:p>
-        </w:tc>
-        <w:tc>
-          <w:tcPr>
-            <w:tcW w:type="dxa" w:w="7087"/>
-          </w:tcPr>
-          <w:p>
-            <w:r/>
-            <w:r>
-              <w:rPr>
-                <w:sz w:val="18"/>
-              </w:rPr>
-              <w:t>productos/models.py, frontend/src/pages/ProveedoresPage.tsx</w:t>
-            </w:r>
-          </w:p>
-        </w:tc>
-      </w:tr>
-    </w:tbl>
-    <w:p/>
-    <w:p>
-      <w:pPr>
-        <w:pStyle w:val="Heading2"/>
-      </w:pPr>
-      <w:r>
-        <w:rPr>
-          <w:color w:val="00843D"/>
-        </w:rPr>
-        <w:t>Ventas (punto de venta)</w:t>
-      </w:r>
-    </w:p>
-    <w:tbl>
-      <w:tblPr>
-        <w:tblStyle w:val="TableGrid"/>
-        <w:tblW w:type="auto" w:w="0"/>
-        <w:jc w:val="left"/>
-        <w:tblLook w:firstColumn="1" w:firstRow="1" w:lastColumn="0" w:lastRow="0" w:noHBand="0" w:noVBand="1" w:val="04A0"/>
-      </w:tblPr>
-      <w:tblGrid>
-        <w:gridCol w:w="4986"/>
-        <w:gridCol w:w="4986"/>
-      </w:tblGrid>
-      <w:tr>
-        <w:tc>
-          <w:tcPr>
-            <w:tcW w:type="dxa" w:w="1984"/>
-          </w:tcPr>
-          <w:p>
-            <w:r/>
-            <w:r>
-              <w:rPr>
-                <w:b/>
-                <w:sz w:val="18"/>
-              </w:rPr>
-              <w:t>Aspecto</w:t>
-            </w:r>
-          </w:p>
-        </w:tc>
-        <w:tc>
-          <w:tcPr>
-            <w:tcW w:type="dxa" w:w="7087"/>
-          </w:tcPr>
-          <w:p>
-            <w:r/>
-            <w:r>
-              <w:rPr>
-                <w:b/>
-                <w:sz w:val="18"/>
-              </w:rPr>
-              <w:t>Detalle</w:t>
-            </w:r>
-          </w:p>
-        </w:tc>
-      </w:tr>
-      <w:tr>
-        <w:tc>
-          <w:tcPr>
-            <w:tcW w:type="dxa" w:w="1984"/>
-          </w:tcPr>
-          <w:p>
-            <w:r/>
-            <w:r>
-              <w:rPr>
-                <w:sz w:val="18"/>
-              </w:rPr>
-              <w:t>Entradas</w:t>
-            </w:r>
-          </w:p>
-        </w:tc>
-        <w:tc>
-          <w:tcPr>
-            <w:tcW w:type="dxa" w:w="7087"/>
-          </w:tcPr>
-          <w:p>
-            <w:r/>
-            <w:r>
-              <w:rPr>
-                <w:sz w:val="18"/>
-              </w:rPr>
-              <w:t>GET/POST /api/ventas/ con filtros desde/hasta</w:t>
-            </w:r>
-          </w:p>
-        </w:tc>
-      </w:tr>
-      <w:tr>
-        <w:tc>
-          <w:tcPr>
-            <w:tcW w:type="dxa" w:w="1984"/>
-          </w:tcPr>
-          <w:p>
-            <w:r/>
-            <w:r>
-              <w:rPr>
-                <w:sz w:val="18"/>
-              </w:rPr>
-              <w:t>Salidas / comportamiento</w:t>
-            </w:r>
-          </w:p>
-        </w:tc>
-        <w:tc>
-          <w:tcPr>
-            <w:tcW w:type="dxa" w:w="7087"/>
-          </w:tcPr>
-          <w:p>
-            <w:r/>
-            <w:r>
-              <w:rPr>
-                <w:sz w:val="18"/>
-              </w:rPr>
-              <w:t>Crea la venta y descuenta stock en transacción atómica; sin stock retorna 400 y revierte.</w:t>
-            </w:r>
-          </w:p>
-        </w:tc>
-      </w:tr>
-      <w:tr>
-        <w:tc>
-          <w:tcPr>
-            <w:tcW w:type="dxa" w:w="1984"/>
-          </w:tcPr>
-          <w:p>
-            <w:r/>
-            <w:r>
-              <w:rPr>
-                <w:sz w:val="18"/>
-              </w:rPr>
-              <w:t>Código</w:t>
-            </w:r>
-          </w:p>
-        </w:tc>
-        <w:tc>
-          <w:tcPr>
-            <w:tcW w:type="dxa" w:w="7087"/>
-          </w:tcPr>
-          <w:p>
-            <w:r/>
-            <w:r>
-              <w:rPr>
-                <w:sz w:val="18"/>
-              </w:rPr>
-              <w:t>productos/serializers.py:VentaCreateSerializer, frontend/src/pages/VentasPage.tsx</w:t>
-            </w:r>
-          </w:p>
-        </w:tc>
-      </w:tr>
-    </w:tbl>
-    <w:p/>
-    <w:p>
-      <w:pPr>
-        <w:pStyle w:val="Heading2"/>
-      </w:pPr>
-      <w:r>
-        <w:rPr>
-          <w:color w:val="00843D"/>
-        </w:rPr>
-        <w:t>Facturación y factura electrónica</w:t>
-      </w:r>
-    </w:p>
-    <w:tbl>
-      <w:tblPr>
-        <w:tblStyle w:val="TableGrid"/>
-        <w:tblW w:type="auto" w:w="0"/>
-        <w:jc w:val="left"/>
-        <w:tblLook w:firstColumn="1" w:firstRow="1" w:lastColumn="0" w:lastRow="0" w:noHBand="0" w:noVBand="1" w:val="04A0"/>
-      </w:tblPr>
-      <w:tblGrid>
-        <w:gridCol w:w="4986"/>
-        <w:gridCol w:w="4986"/>
-      </w:tblGrid>
-      <w:tr>
-        <w:tc>
-          <w:tcPr>
-            <w:tcW w:type="dxa" w:w="1984"/>
-          </w:tcPr>
-          <w:p>
-            <w:r/>
-            <w:r>
-              <w:rPr>
-                <w:b/>
-                <w:sz w:val="18"/>
-              </w:rPr>
-              <w:t>Aspecto</w:t>
-            </w:r>
-          </w:p>
-        </w:tc>
-        <w:tc>
-          <w:tcPr>
-            <w:tcW w:type="dxa" w:w="7087"/>
-          </w:tcPr>
-          <w:p>
-            <w:r/>
-            <w:r>
-              <w:rPr>
-                <w:b/>
-                <w:sz w:val="18"/>
-              </w:rPr>
-              <w:t>Detalle</w:t>
-            </w:r>
-          </w:p>
-        </w:tc>
-      </w:tr>
-      <w:tr>
-        <w:tc>
-          <w:tcPr>
-            <w:tcW w:type="dxa" w:w="1984"/>
-          </w:tcPr>
-          <w:p>
-            <w:r/>
-            <w:r>
-              <w:rPr>
-                <w:sz w:val="18"/>
-              </w:rPr>
-              <w:t>Entradas</w:t>
-            </w:r>
-          </w:p>
-        </w:tc>
-        <w:tc>
-          <w:tcPr>
-            <w:tcW w:type="dxa" w:w="7087"/>
-          </w:tcPr>
-          <w:p>
-            <w:r/>
-            <w:r>
-              <w:rPr>
-                <w:sz w:val="18"/>
-              </w:rPr>
-              <w:t>POST /api/ventas/{id}/facturar/, /api/facturas/, /emitir/, /anular/, /pdf/, /ubl/, /api/notas-credito/</w:t>
-            </w:r>
-          </w:p>
-        </w:tc>
-      </w:tr>
-      <w:tr>
-        <w:tc>
-          <w:tcPr>
-            <w:tcW w:type="dxa" w:w="1984"/>
-          </w:tcPr>
-          <w:p>
-            <w:r/>
-            <w:r>
-              <w:rPr>
-                <w:sz w:val="18"/>
-              </w:rPr>
-              <w:t>Salidas / comportamiento</w:t>
-            </w:r>
-          </w:p>
-        </w:tc>
-        <w:tc>
-          <w:tcPr>
-            <w:tcW w:type="dxa" w:w="7087"/>
-          </w:tcPr>
-          <w:p>
-            <w:r/>
-            <w:r>
-              <w:rPr>
-                <w:sz w:val="18"/>
-              </w:rPr>
-              <w:t>Consecutivo atómico FAC/NC, IVA 19%, CUFE SHA-384, UBL 2.1, proveedor DIAN intercambiable; anular crea NC.</w:t>
-            </w:r>
-          </w:p>
-        </w:tc>
-      </w:tr>
-      <w:tr>
-        <w:tc>
-          <w:tcPr>
-            <w:tcW w:type="dxa" w:w="1984"/>
-          </w:tcPr>
-          <w:p>
-            <w:r/>
-            <w:r>
-              <w:rPr>
-                <w:sz w:val="18"/>
-              </w:rPr>
-              <w:t>Código</w:t>
-            </w:r>
-          </w:p>
-        </w:tc>
-        <w:tc>
-          <w:tcPr>
-            <w:tcW w:type="dxa" w:w="7087"/>
-          </w:tcPr>
-          <w:p>
-            <w:r/>
-            <w:r>
-              <w:rPr>
-                <w:sz w:val="18"/>
-              </w:rPr>
-              <w:t>productos/fe/, productos/models.py:Factura, frontend/src/pages/FacturasPage.tsx</w:t>
-            </w:r>
-          </w:p>
-        </w:tc>
-      </w:tr>
-    </w:tbl>
-    <w:p/>
-    <w:p>
-      <w:pPr>
-        <w:pStyle w:val="Heading2"/>
-      </w:pPr>
-      <w:r>
-        <w:rPr>
-          <w:color w:val="00843D"/>
-        </w:rPr>
-        <w:t>Dashboard y reportes</w:t>
-      </w:r>
-    </w:p>
-    <w:tbl>
-      <w:tblPr>
-        <w:tblStyle w:val="TableGrid"/>
-        <w:tblW w:type="auto" w:w="0"/>
-        <w:jc w:val="left"/>
-        <w:tblLook w:firstColumn="1" w:firstRow="1" w:lastColumn="0" w:lastRow="0" w:noHBand="0" w:noVBand="1" w:val="04A0"/>
-      </w:tblPr>
-      <w:tblGrid>
-        <w:gridCol w:w="4986"/>
-        <w:gridCol w:w="4986"/>
-      </w:tblGrid>
-      <w:tr>
-        <w:tc>
-          <w:tcPr>
-            <w:tcW w:type="dxa" w:w="1984"/>
-          </w:tcPr>
-          <w:p>
-            <w:r/>
-            <w:r>
-              <w:rPr>
-                <w:b/>
-                <w:sz w:val="18"/>
-              </w:rPr>
-              <w:t>Aspecto</w:t>
-            </w:r>
-          </w:p>
-        </w:tc>
-        <w:tc>
-          <w:tcPr>
-            <w:tcW w:type="dxa" w:w="7087"/>
-          </w:tcPr>
-          <w:p>
-            <w:r/>
-            <w:r>
-              <w:rPr>
-                <w:b/>
-                <w:sz w:val="18"/>
-              </w:rPr>
-              <w:t>Detalle</w:t>
-            </w:r>
-          </w:p>
-        </w:tc>
-      </w:tr>
-      <w:tr>
-        <w:tc>
-          <w:tcPr>
-            <w:tcW w:type="dxa" w:w="1984"/>
-          </w:tcPr>
-          <w:p>
-            <w:r/>
-            <w:r>
-              <w:rPr>
-                <w:sz w:val="18"/>
-              </w:rPr>
-              <w:t>Entradas</w:t>
-            </w:r>
-          </w:p>
-        </w:tc>
-        <w:tc>
-          <w:tcPr>
-            <w:tcW w:type="dxa" w:w="7087"/>
-          </w:tcPr>
-          <w:p>
-            <w:r/>
-            <w:r>
-              <w:rPr>
-                <w:sz w:val="18"/>
-              </w:rPr>
-              <w:t>GET /api/dashboard/ (caché 60 s), /api/reportes/*, exportar excel|pdf</w:t>
-            </w:r>
-          </w:p>
-        </w:tc>
-      </w:tr>
-      <w:tr>
-        <w:tc>
-          <w:tcPr>
-            <w:tcW w:type="dxa" w:w="1984"/>
-          </w:tcPr>
-          <w:p>
-            <w:r/>
-            <w:r>
-              <w:rPr>
-                <w:sz w:val="18"/>
-              </w:rPr>
-              <w:t>Salidas / comportamiento</w:t>
-            </w:r>
-          </w:p>
-        </w:tc>
-        <w:tc>
-          <w:tcPr>
-            <w:tcW w:type="dxa" w:w="7087"/>
-          </w:tcPr>
-          <w:p>
-            <w:r/>
-            <w:r>
-              <w:rPr>
-                <w:sz w:val="18"/>
-              </w:rPr>
-              <w:t>KPIs, recientes, ranking, exportaciones Excel/PDF.</w:t>
-            </w:r>
-          </w:p>
-        </w:tc>
-      </w:tr>
-      <w:tr>
-        <w:tc>
-          <w:tcPr>
-            <w:tcW w:type="dxa" w:w="1984"/>
-          </w:tcPr>
-          <w:p>
-            <w:r/>
-            <w:r>
-              <w:rPr>
-                <w:sz w:val="18"/>
-              </w:rPr>
-              <w:t>Código</w:t>
-            </w:r>
-          </w:p>
-        </w:tc>
-        <w:tc>
-          <w:tcPr>
-            <w:tcW w:type="dxa" w:w="7087"/>
-          </w:tcPr>
-          <w:p>
-            <w:r/>
-            <w:r>
-              <w:rPr>
-                <w:sz w:val="18"/>
-              </w:rPr>
-              <w:t>productos/api_views.py, DashboardPage.tsx, ReportesPage.tsx</w:t>
-            </w:r>
-          </w:p>
-        </w:tc>
-      </w:tr>
-    </w:tbl>
-    <w:p/>
-    <w:p>
-      <w:pPr>
-        <w:pStyle w:val="Heading2"/>
-      </w:pPr>
-      <w:r>
-        <w:rPr>
-          <w:color w:val="00843D"/>
-        </w:rPr>
-        <w:t>Transversales</w:t>
-      </w:r>
-    </w:p>
-    <w:tbl>
-      <w:tblPr>
-        <w:tblStyle w:val="TableGrid"/>
-        <w:tblW w:type="auto" w:w="0"/>
-        <w:jc w:val="left"/>
-        <w:tblLook w:firstColumn="1" w:firstRow="1" w:lastColumn="0" w:lastRow="0" w:noHBand="0" w:noVBand="1" w:val="04A0"/>
-      </w:tblPr>
-      <w:tblGrid>
-        <w:gridCol w:w="4986"/>
-        <w:gridCol w:w="4986"/>
-      </w:tblGrid>
-      <w:tr>
-        <w:tc>
-          <w:tcPr>
-            <w:tcW w:type="dxa" w:w="1984"/>
-          </w:tcPr>
-          <w:p>
-            <w:r/>
-            <w:r>
-              <w:rPr>
-                <w:b/>
-                <w:sz w:val="18"/>
-              </w:rPr>
-              <w:t>Aspecto</w:t>
-            </w:r>
-          </w:p>
-        </w:tc>
-        <w:tc>
-          <w:tcPr>
-            <w:tcW w:type="dxa" w:w="7087"/>
-          </w:tcPr>
-          <w:p>
-            <w:r/>
-            <w:r>
-              <w:rPr>
-                <w:b/>
-                <w:sz w:val="18"/>
-              </w:rPr>
-              <w:t>Detalle</w:t>
-            </w:r>
-          </w:p>
-        </w:tc>
-      </w:tr>
-      <w:tr>
-        <w:tc>
-          <w:tcPr>
-            <w:tcW w:type="dxa" w:w="1984"/>
-          </w:tcPr>
-          <w:p>
-            <w:r/>
-            <w:r>
-              <w:rPr>
-                <w:sz w:val="18"/>
-              </w:rPr>
-              <w:t>Entradas</w:t>
-            </w:r>
-          </w:p>
-        </w:tc>
-        <w:tc>
-          <w:tcPr>
-            <w:tcW w:type="dxa" w:w="7087"/>
-          </w:tcPr>
-          <w:p>
-            <w:r/>
-            <w:r>
-              <w:rPr>
-                <w:sz w:val="18"/>
-              </w:rPr>
-              <w:t>GET /api/health/, /api/docs/, /api/redoc/, /admin/</w:t>
-            </w:r>
-          </w:p>
-        </w:tc>
-      </w:tr>
-      <w:tr>
-        <w:tc>
-          <w:tcPr>
-            <w:tcW w:type="dxa" w:w="1984"/>
-          </w:tcPr>
-          <w:p>
-            <w:r/>
-            <w:r>
-              <w:rPr>
-                <w:sz w:val="18"/>
-              </w:rPr>
-              <w:t>Salidas / comportamiento</w:t>
-            </w:r>
-          </w:p>
-        </w:tc>
-        <w:tc>
-          <w:tcPr>
-            <w:tcW w:type="dxa" w:w="7087"/>
-          </w:tcPr>
-          <w:p>
-            <w:r/>
-            <w:r>
-              <w:rPr>
-                <w:sz w:val="18"/>
-              </w:rPr>
-              <w:t>Health-check, OpenAPI, admin Django (9 modelos), throttling, caché.</w:t>
-            </w:r>
-          </w:p>
-        </w:tc>
-      </w:tr>
-      <w:tr>
-        <w:tc>
-          <w:tcPr>
-            <w:tcW w:type="dxa" w:w="1984"/>
-          </w:tcPr>
-          <w:p>
-            <w:r/>
-            <w:r>
-              <w:rPr>
-                <w:sz w:val="18"/>
-              </w:rPr>
-              <w:t>Código</w:t>
-            </w:r>
-          </w:p>
-        </w:tc>
-        <w:tc>
-          <w:tcPr>
-            <w:tcW w:type="dxa" w:w="7087"/>
-          </w:tcPr>
-          <w:p>
-            <w:r/>
-            <w:r>
-              <w:rPr>
-                <w:sz w:val="18"/>
-              </w:rPr>
-              <w:t>config/urls.py, productos/urls_api.py, productos/admin.py</w:t>
-            </w:r>
-          </w:p>
-        </w:tc>
-      </w:tr>
-    </w:tbl>
-    <w:p/>
     <w:p>
       <w:pPr>
         <w:pStyle w:val="Heading1"/>
@@ -1400,33 +1269,7 @@
         <w:rPr>
           <w:color w:val="00843D"/>
         </w:rPr>
-        <w:t>2. Documento técnico del sistema (ítem 2)</w:t>
-      </w:r>
-    </w:p>
-    <w:p>
-      <w:r>
-        <w:t>2.1 Descripción general. InvenXis es un sistema de gestión de inventarios, proveedores, ventas y facturación electrónica, con arquitectura API-first: backend Django + DRF y SPA React.</w:t>
-      </w:r>
-    </w:p>
-    <w:p>
-      <w:r>
-        <w:t>2.2 Arquitectura. Petición HTTP → config/urls.py → productos/urls_api.py → APIView/serializers → ORM → PostgreSQL/SQLite → JSON → TanStack Query → React. Decisiones: transacciones atómicas, caché con invalidación, throttling, paginación estándar y code-splitting por ruta.</w:t>
-      </w:r>
-    </w:p>
-    <w:p>
-      <w:r>
-        <w:t>2.3 Modelo de datos. Proveedor 1—N Producto; Proveedor 1—N Pedido 1—N DetallePedido; Venta 1—N DetalleVenta; Venta 1—1 Factura 1—N NotaCredito; ContadorDocumento; User/Group para RBAC.</w:t>
-      </w:r>
-    </w:p>
-    <w:p>
-      <w:pPr>
-        <w:pStyle w:val="Heading2"/>
-      </w:pPr>
-      <w:r>
-        <w:rPr>
-          <w:color w:val="00843D"/>
-        </w:rPr>
-        <w:t>2.4 Tecnologías y versiones (verificadas)</w:t>
+        <w:t>4. Ítem 3 — Ambiente de desarrollo y pruebas</w:t>
       </w:r>
     </w:p>
     <w:tbl>
@@ -1444,7 +1287,7 @@
       <w:tr>
         <w:tc>
           <w:tcPr>
-            <w:tcW w:type="dxa" w:w="1701"/>
+            <w:tcW w:type="dxa" w:w="2551"/>
           </w:tcPr>
           <w:p>
             <w:r/>
@@ -1453,13 +1296,13 @@
                 <w:b/>
                 <w:sz w:val="18"/>
               </w:rPr>
-              <w:t>Capa</w:t>
+              <w:t>Herramienta</w:t>
             </w:r>
           </w:p>
         </w:tc>
         <w:tc>
           <w:tcPr>
-            <w:tcW w:type="dxa" w:w="3402"/>
+            <w:tcW w:type="dxa" w:w="2268"/>
           </w:tcPr>
           <w:p>
             <w:r/>
@@ -1468,13 +1311,13 @@
                 <w:b/>
                 <w:sz w:val="18"/>
               </w:rPr>
-              <w:t>Tecnología y versión</w:t>
+              <w:t>Versión</w:t>
             </w:r>
           </w:p>
         </w:tc>
         <w:tc>
           <w:tcPr>
-            <w:tcW w:type="dxa" w:w="3969"/>
+            <w:tcW w:type="dxa" w:w="4252"/>
           </w:tcPr>
           <w:p>
             <w:r/>
@@ -1483,7 +1326,7 @@
                 <w:b/>
                 <w:sz w:val="18"/>
               </w:rPr>
-              <w:t>Uso</w:t>
+              <w:t>Rol</w:t>
             </w:r>
           </w:p>
         </w:tc>
@@ -1491,7 +1334,7 @@
       <w:tr>
         <w:tc>
           <w:tcPr>
-            <w:tcW w:type="dxa" w:w="1701"/>
+            <w:tcW w:type="dxa" w:w="2551"/>
           </w:tcPr>
           <w:p>
             <w:r/>
@@ -1499,13 +1342,13 @@
               <w:rPr>
                 <w:sz w:val="18"/>
               </w:rPr>
-              <w:t>Lenguaje</w:t>
+              <w:t>Python</w:t>
             </w:r>
           </w:p>
         </w:tc>
         <w:tc>
           <w:tcPr>
-            <w:tcW w:type="dxa" w:w="3402"/>
+            <w:tcW w:type="dxa" w:w="2268"/>
           </w:tcPr>
           <w:p>
             <w:r/>
@@ -1513,13 +1356,13 @@
               <w:rPr>
                 <w:sz w:val="18"/>
               </w:rPr>
-              <w:t>Python 3.13.7</w:t>
+              <w:t>3.13.7</w:t>
             </w:r>
           </w:p>
         </w:tc>
         <w:tc>
           <w:tcPr>
-            <w:tcW w:type="dxa" w:w="3969"/>
+            <w:tcW w:type="dxa" w:w="4252"/>
           </w:tcPr>
           <w:p>
             <w:r/>
@@ -1527,7 +1370,7 @@
               <w:rPr>
                 <w:sz w:val="18"/>
               </w:rPr>
-              <w:t>Backend</w:t>
+              <w:t>Lenguaje backend</w:t>
             </w:r>
           </w:p>
         </w:tc>
@@ -1535,7 +1378,7 @@
       <w:tr>
         <w:tc>
           <w:tcPr>
-            <w:tcW w:type="dxa" w:w="1701"/>
+            <w:tcW w:type="dxa" w:w="2551"/>
           </w:tcPr>
           <w:p>
             <w:r/>
@@ -1543,13 +1386,13 @@
               <w:rPr>
                 <w:sz w:val="18"/>
               </w:rPr>
-              <w:t>Framework</w:t>
+              <w:t>Django / DRF</w:t>
             </w:r>
           </w:p>
         </w:tc>
         <w:tc>
           <w:tcPr>
-            <w:tcW w:type="dxa" w:w="3402"/>
+            <w:tcW w:type="dxa" w:w="2268"/>
           </w:tcPr>
           <w:p>
             <w:r/>
@@ -1557,13 +1400,13 @@
               <w:rPr>
                 <w:sz w:val="18"/>
               </w:rPr>
-              <w:t>Django 6.0.7</w:t>
+              <w:t>6.0.7 / 3.17.1</w:t>
             </w:r>
           </w:p>
         </w:tc>
         <w:tc>
           <w:tcPr>
-            <w:tcW w:type="dxa" w:w="3969"/>
+            <w:tcW w:type="dxa" w:w="4252"/>
           </w:tcPr>
           <w:p>
             <w:r/>
@@ -1571,7 +1414,7 @@
               <w:rPr>
                 <w:sz w:val="18"/>
               </w:rPr>
-              <w:t>Servidor y ORM</w:t>
+              <w:t>Framework y API</w:t>
             </w:r>
           </w:p>
         </w:tc>
@@ -1579,7 +1422,7 @@
       <w:tr>
         <w:tc>
           <w:tcPr>
-            <w:tcW w:type="dxa" w:w="1701"/>
+            <w:tcW w:type="dxa" w:w="2551"/>
           </w:tcPr>
           <w:p>
             <w:r/>
@@ -1587,13 +1430,13 @@
               <w:rPr>
                 <w:sz w:val="18"/>
               </w:rPr>
-              <w:t>API</w:t>
+              <w:t>Node.js / npm</w:t>
             </w:r>
           </w:p>
         </w:tc>
         <w:tc>
           <w:tcPr>
-            <w:tcW w:type="dxa" w:w="3402"/>
+            <w:tcW w:type="dxa" w:w="2268"/>
           </w:tcPr>
           <w:p>
             <w:r/>
@@ -1601,13 +1444,13 @@
               <w:rPr>
                 <w:sz w:val="18"/>
               </w:rPr>
-              <w:t>DRF 3.17.1 + SimpleJWT + drf-spectacular</w:t>
+              <w:t>24.16.0 / 11.13.0</w:t>
             </w:r>
           </w:p>
         </w:tc>
         <w:tc>
           <w:tcPr>
-            <w:tcW w:type="dxa" w:w="3969"/>
+            <w:tcW w:type="dxa" w:w="4252"/>
           </w:tcPr>
           <w:p>
             <w:r/>
@@ -1615,7 +1458,7 @@
               <w:rPr>
                 <w:sz w:val="18"/>
               </w:rPr>
-              <w:t>REST, auth, OpenAPI</w:t>
+              <w:t>Runtime frontend</w:t>
             </w:r>
           </w:p>
         </w:tc>
@@ -1623,7 +1466,7 @@
       <w:tr>
         <w:tc>
           <w:tcPr>
-            <w:tcW w:type="dxa" w:w="1701"/>
+            <w:tcW w:type="dxa" w:w="2551"/>
           </w:tcPr>
           <w:p>
             <w:r/>
@@ -1631,13 +1474,13 @@
               <w:rPr>
                 <w:sz w:val="18"/>
               </w:rPr>
-              <w:t>Base de datos</w:t>
+              <w:t>React / Vite / TS</w:t>
             </w:r>
           </w:p>
         </w:tc>
         <w:tc>
           <w:tcPr>
-            <w:tcW w:type="dxa" w:w="3402"/>
+            <w:tcW w:type="dxa" w:w="2268"/>
           </w:tcPr>
           <w:p>
             <w:r/>
@@ -1645,189 +1488,13 @@
               <w:rPr>
                 <w:sz w:val="18"/>
               </w:rPr>
-              <w:t>SQLite (dev) / PostgreSQL 16 (prod)</w:t>
+              <w:t>19.2.8 / 8.1.5 / 6.0.3</w:t>
             </w:r>
           </w:p>
         </w:tc>
         <w:tc>
           <w:tcPr>
-            <w:tcW w:type="dxa" w:w="3969"/>
-          </w:tcPr>
-          <w:p>
-            <w:r/>
-            <w:r>
-              <w:rPr>
-                <w:sz w:val="18"/>
-              </w:rPr>
-              <w:t>Persistencia</w:t>
-            </w:r>
-          </w:p>
-        </w:tc>
-      </w:tr>
-      <w:tr>
-        <w:tc>
-          <w:tcPr>
-            <w:tcW w:type="dxa" w:w="1701"/>
-          </w:tcPr>
-          <w:p>
-            <w:r/>
-            <w:r>
-              <w:rPr>
-                <w:sz w:val="18"/>
-              </w:rPr>
-              <w:t>Caché</w:t>
-            </w:r>
-          </w:p>
-        </w:tc>
-        <w:tc>
-          <w:tcPr>
-            <w:tcW w:type="dxa" w:w="3402"/>
-          </w:tcPr>
-          <w:p>
-            <w:r/>
-            <w:r>
-              <w:rPr>
-                <w:sz w:val="18"/>
-              </w:rPr>
-              <w:t>Redis 7 (prod) / local (dev)</w:t>
-            </w:r>
-          </w:p>
-        </w:tc>
-        <w:tc>
-          <w:tcPr>
-            <w:tcW w:type="dxa" w:w="3969"/>
-          </w:tcPr>
-          <w:p>
-            <w:r/>
-            <w:r>
-              <w:rPr>
-                <w:sz w:val="18"/>
-              </w:rPr>
-              <w:t>Dashboard</w:t>
-            </w:r>
-          </w:p>
-        </w:tc>
-      </w:tr>
-      <w:tr>
-        <w:tc>
-          <w:tcPr>
-            <w:tcW w:type="dxa" w:w="1701"/>
-          </w:tcPr>
-          <w:p>
-            <w:r/>
-            <w:r>
-              <w:rPr>
-                <w:sz w:val="18"/>
-              </w:rPr>
-              <w:t>Servidor prod</w:t>
-            </w:r>
-          </w:p>
-        </w:tc>
-        <w:tc>
-          <w:tcPr>
-            <w:tcW w:type="dxa" w:w="3402"/>
-          </w:tcPr>
-          <w:p>
-            <w:r/>
-            <w:r>
-              <w:rPr>
-                <w:sz w:val="18"/>
-              </w:rPr>
-              <w:t>Gunicorn + WhiteNoise (Docker)</w:t>
-            </w:r>
-          </w:p>
-        </w:tc>
-        <w:tc>
-          <w:tcPr>
-            <w:tcW w:type="dxa" w:w="3969"/>
-          </w:tcPr>
-          <w:p>
-            <w:r/>
-            <w:r>
-              <w:rPr>
-                <w:sz w:val="18"/>
-              </w:rPr>
-              <w:t>Despliegue</w:t>
-            </w:r>
-          </w:p>
-        </w:tc>
-      </w:tr>
-      <w:tr>
-        <w:tc>
-          <w:tcPr>
-            <w:tcW w:type="dxa" w:w="1701"/>
-          </w:tcPr>
-          <w:p>
-            <w:r/>
-            <w:r>
-              <w:rPr>
-                <w:sz w:val="18"/>
-              </w:rPr>
-              <w:t>Lenguaje</w:t>
-            </w:r>
-          </w:p>
-        </w:tc>
-        <w:tc>
-          <w:tcPr>
-            <w:tcW w:type="dxa" w:w="3402"/>
-          </w:tcPr>
-          <w:p>
-            <w:r/>
-            <w:r>
-              <w:rPr>
-                <w:sz w:val="18"/>
-              </w:rPr>
-              <w:t>TypeScript 6.0.3</w:t>
-            </w:r>
-          </w:p>
-        </w:tc>
-        <w:tc>
-          <w:tcPr>
-            <w:tcW w:type="dxa" w:w="3969"/>
-          </w:tcPr>
-          <w:p>
-            <w:r/>
-            <w:r>
-              <w:rPr>
-                <w:sz w:val="18"/>
-              </w:rPr>
-              <w:t>Frontend tipado</w:t>
-            </w:r>
-          </w:p>
-        </w:tc>
-      </w:tr>
-      <w:tr>
-        <w:tc>
-          <w:tcPr>
-            <w:tcW w:type="dxa" w:w="1701"/>
-          </w:tcPr>
-          <w:p>
-            <w:r/>
-            <w:r>
-              <w:rPr>
-                <w:sz w:val="18"/>
-              </w:rPr>
-              <w:t>UI</w:t>
-            </w:r>
-          </w:p>
-        </w:tc>
-        <w:tc>
-          <w:tcPr>
-            <w:tcW w:type="dxa" w:w="3402"/>
-          </w:tcPr>
-          <w:p>
-            <w:r/>
-            <w:r>
-              <w:rPr>
-                <w:sz w:val="18"/>
-              </w:rPr>
-              <w:t>React 19.2.8 + Vite 8.1.5 + Tailwind v4</w:t>
-            </w:r>
-          </w:p>
-        </w:tc>
-        <w:tc>
-          <w:tcPr>
-            <w:tcW w:type="dxa" w:w="3969"/>
+            <w:tcW w:type="dxa" w:w="4252"/>
           </w:tcPr>
           <w:p>
             <w:r/>
@@ -1843,7 +1510,7 @@
       <w:tr>
         <w:tc>
           <w:tcPr>
-            <w:tcW w:type="dxa" w:w="1701"/>
+            <w:tcW w:type="dxa" w:w="2551"/>
           </w:tcPr>
           <w:p>
             <w:r/>
@@ -1851,13 +1518,13 @@
               <w:rPr>
                 <w:sz w:val="18"/>
               </w:rPr>
-              <w:t>Datos</w:t>
+              <w:t>SQLite / PostgreSQL</w:t>
             </w:r>
           </w:p>
         </w:tc>
         <w:tc>
           <w:tcPr>
-            <w:tcW w:type="dxa" w:w="3402"/>
+            <w:tcW w:type="dxa" w:w="2268"/>
           </w:tcPr>
           <w:p>
             <w:r/>
@@ -1865,13 +1532,13 @@
               <w:rPr>
                 <w:sz w:val="18"/>
               </w:rPr>
-              <w:t>Axios + TanStack Query 5</w:t>
+              <w:t>dev / 16 prod</w:t>
             </w:r>
           </w:p>
         </w:tc>
         <w:tc>
           <w:tcPr>
-            <w:tcW w:type="dxa" w:w="3969"/>
+            <w:tcW w:type="dxa" w:w="4252"/>
           </w:tcPr>
           <w:p>
             <w:r/>
@@ -1879,7 +1546,7 @@
               <w:rPr>
                 <w:sz w:val="18"/>
               </w:rPr>
-              <w:t>HTTP, caché cliente</w:t>
+              <w:t>Base de datos</w:t>
             </w:r>
           </w:p>
         </w:tc>
@@ -1887,360 +1554,7 @@
       <w:tr>
         <w:tc>
           <w:tcPr>
-            <w:tcW w:type="dxa" w:w="1701"/>
-          </w:tcPr>
-          <w:p>
-            <w:r/>
-            <w:r>
-              <w:rPr>
-                <w:sz w:val="18"/>
-              </w:rPr>
-              <w:t>Calidad</w:t>
-            </w:r>
-          </w:p>
-        </w:tc>
-        <w:tc>
-          <w:tcPr>
-            <w:tcW w:type="dxa" w:w="3402"/>
-          </w:tcPr>
-          <w:p>
-            <w:r/>
-            <w:r>
-              <w:rPr>
-                <w:sz w:val="18"/>
-              </w:rPr>
-              <w:t>pytest + Playwright + oxlint + tsc</w:t>
-            </w:r>
-          </w:p>
-        </w:tc>
-        <w:tc>
-          <w:tcPr>
-            <w:tcW w:type="dxa" w:w="3969"/>
-          </w:tcPr>
-          <w:p>
-            <w:r/>
-            <w:r>
-              <w:rPr>
-                <w:sz w:val="18"/>
-              </w:rPr>
-              <w:t>Tests y lint</w:t>
-            </w:r>
-          </w:p>
-        </w:tc>
-      </w:tr>
-      <w:tr>
-        <w:tc>
-          <w:tcPr>
-            <w:tcW w:type="dxa" w:w="1701"/>
-          </w:tcPr>
-          <w:p>
-            <w:r/>
-            <w:r>
-              <w:rPr>
-                <w:sz w:val="18"/>
-              </w:rPr>
-              <w:t>Runtime</w:t>
-            </w:r>
-          </w:p>
-        </w:tc>
-        <w:tc>
-          <w:tcPr>
-            <w:tcW w:type="dxa" w:w="3402"/>
-          </w:tcPr>
-          <w:p>
-            <w:r/>
-            <w:r>
-              <w:rPr>
-                <w:sz w:val="18"/>
-              </w:rPr>
-              <w:t>Node 24.16.0 / npm 11.13.0</w:t>
-            </w:r>
-          </w:p>
-        </w:tc>
-        <w:tc>
-          <w:tcPr>
-            <w:tcW w:type="dxa" w:w="3969"/>
-          </w:tcPr>
-          <w:p>
-            <w:r/>
-            <w:r>
-              <w:rPr>
-                <w:sz w:val="18"/>
-              </w:rPr>
-              <w:t>Frontend</w:t>
-            </w:r>
-          </w:p>
-        </w:tc>
-      </w:tr>
-    </w:tbl>
-    <w:p/>
-    <w:p>
-      <w:r>
-        <w:t>2.5 Instalación y ejecución. Backend: python -m venv venv; pip install -r requirements.txt; copiar .env.example a .env; python manage.py migrate; python manage.py seed_data; python manage.py runserver (http://127.0.0.1:8000). Frontend: cd frontend; npm install; npm run dev (http://localhost:3000). Demo: admin/admin, operador/operador123. Producción: docker compose up --build.</w:t>
-      </w:r>
-    </w:p>
-    <w:p>
-      <w:r>
-        <w:t>2.6 Manual de usuario (resumen). Ingresar → Dashboard → Productos → Proveedores → Ventas → Facturación (facturar, emitir FE, PDF/UBL, anular con nota crédito, solo Administradores) → Reportes. El escudo del sidebar abre el admin Django.</w:t>
-      </w:r>
-    </w:p>
-    <w:p>
-      <w:r>
-        <w:t>2.7 Conclusiones. El sistema cumple el alcance con calidad verificable (45 pruebas backend + 2 e2e en verde); queda como trabajo futuro la integración real con la DIAN.</w:t>
-      </w:r>
-    </w:p>
-    <w:p>
-      <w:pPr>
-        <w:pStyle w:val="Heading1"/>
-      </w:pPr>
-      <w:r>
-        <w:rPr>
-          <w:color w:val="00843D"/>
-        </w:rPr>
-        <w:t>3. Ambiente de desarrollo y pruebas (ítem 3)</w:t>
-      </w:r>
-    </w:p>
-    <w:tbl>
-      <w:tblPr>
-        <w:tblStyle w:val="TableGrid"/>
-        <w:tblW w:type="auto" w:w="0"/>
-        <w:jc w:val="left"/>
-        <w:tblLook w:firstColumn="1" w:firstRow="1" w:lastColumn="0" w:lastRow="0" w:noHBand="0" w:noVBand="1" w:val="04A0"/>
-      </w:tblPr>
-      <w:tblGrid>
-        <w:gridCol w:w="4986"/>
-        <w:gridCol w:w="4986"/>
-      </w:tblGrid>
-      <w:tr>
-        <w:tc>
-          <w:tcPr>
-            <w:tcW w:type="dxa" w:w="3402"/>
-          </w:tcPr>
-          <w:p>
-            <w:r/>
-            <w:r>
-              <w:rPr>
-                <w:b/>
-                <w:sz w:val="18"/>
-              </w:rPr>
-              <w:t>Herramienta</w:t>
-            </w:r>
-          </w:p>
-        </w:tc>
-        <w:tc>
-          <w:tcPr>
-            <w:tcW w:type="dxa" w:w="5669"/>
-          </w:tcPr>
-          <w:p>
-            <w:r/>
-            <w:r>
-              <w:rPr>
-                <w:b/>
-                <w:sz w:val="18"/>
-              </w:rPr>
-              <w:t>Versión</w:t>
-            </w:r>
-          </w:p>
-        </w:tc>
-      </w:tr>
-      <w:tr>
-        <w:tc>
-          <w:tcPr>
-            <w:tcW w:type="dxa" w:w="3402"/>
-          </w:tcPr>
-          <w:p>
-            <w:r/>
-            <w:r>
-              <w:rPr>
-                <w:sz w:val="18"/>
-              </w:rPr>
-              <w:t>Python</w:t>
-            </w:r>
-          </w:p>
-        </w:tc>
-        <w:tc>
-          <w:tcPr>
-            <w:tcW w:type="dxa" w:w="5669"/>
-          </w:tcPr>
-          <w:p>
-            <w:r/>
-            <w:r>
-              <w:rPr>
-                <w:sz w:val="18"/>
-              </w:rPr>
-              <w:t>3.13.7</w:t>
-            </w:r>
-          </w:p>
-        </w:tc>
-      </w:tr>
-      <w:tr>
-        <w:tc>
-          <w:tcPr>
-            <w:tcW w:type="dxa" w:w="3402"/>
-          </w:tcPr>
-          <w:p>
-            <w:r/>
-            <w:r>
-              <w:rPr>
-                <w:sz w:val="18"/>
-              </w:rPr>
-              <w:t>Django / DRF</w:t>
-            </w:r>
-          </w:p>
-        </w:tc>
-        <w:tc>
-          <w:tcPr>
-            <w:tcW w:type="dxa" w:w="5669"/>
-          </w:tcPr>
-          <w:p>
-            <w:r/>
-            <w:r>
-              <w:rPr>
-                <w:sz w:val="18"/>
-              </w:rPr>
-              <w:t>6.0.7 / 3.17.1</w:t>
-            </w:r>
-          </w:p>
-        </w:tc>
-      </w:tr>
-      <w:tr>
-        <w:tc>
-          <w:tcPr>
-            <w:tcW w:type="dxa" w:w="3402"/>
-          </w:tcPr>
-          <w:p>
-            <w:r/>
-            <w:r>
-              <w:rPr>
-                <w:sz w:val="18"/>
-              </w:rPr>
-              <w:t>Node.js / npm</w:t>
-            </w:r>
-          </w:p>
-        </w:tc>
-        <w:tc>
-          <w:tcPr>
-            <w:tcW w:type="dxa" w:w="5669"/>
-          </w:tcPr>
-          <w:p>
-            <w:r/>
-            <w:r>
-              <w:rPr>
-                <w:sz w:val="18"/>
-              </w:rPr>
-              <w:t>24.16.0 / 11.13.0</w:t>
-            </w:r>
-          </w:p>
-        </w:tc>
-      </w:tr>
-      <w:tr>
-        <w:tc>
-          <w:tcPr>
-            <w:tcW w:type="dxa" w:w="3402"/>
-          </w:tcPr>
-          <w:p>
-            <w:r/>
-            <w:r>
-              <w:rPr>
-                <w:sz w:val="18"/>
-              </w:rPr>
-              <w:t>React / Vite / TypeScript</w:t>
-            </w:r>
-          </w:p>
-        </w:tc>
-        <w:tc>
-          <w:tcPr>
-            <w:tcW w:type="dxa" w:w="5669"/>
-          </w:tcPr>
-          <w:p>
-            <w:r/>
-            <w:r>
-              <w:rPr>
-                <w:sz w:val="18"/>
-              </w:rPr>
-              <w:t>19.2.8 / 8.1.5 / 6.0.3</w:t>
-            </w:r>
-          </w:p>
-        </w:tc>
-      </w:tr>
-      <w:tr>
-        <w:tc>
-          <w:tcPr>
-            <w:tcW w:type="dxa" w:w="3402"/>
-          </w:tcPr>
-          <w:p>
-            <w:r/>
-            <w:r>
-              <w:rPr>
-                <w:sz w:val="18"/>
-              </w:rPr>
-              <w:t>Base de datos dev</w:t>
-            </w:r>
-          </w:p>
-        </w:tc>
-        <w:tc>
-          <w:tcPr>
-            <w:tcW w:type="dxa" w:w="5669"/>
-          </w:tcPr>
-          <w:p>
-            <w:r/>
-            <w:r>
-              <w:rPr>
-                <w:sz w:val="18"/>
-              </w:rPr>
-              <w:t>SQLite (db.sqlite3, ignorada por git)</w:t>
-            </w:r>
-          </w:p>
-        </w:tc>
-      </w:tr>
-      <w:tr>
-        <w:tc>
-          <w:tcPr>
-            <w:tcW w:type="dxa" w:w="3402"/>
-          </w:tcPr>
-          <w:p>
-            <w:r/>
-            <w:r>
-              <w:rPr>
-                <w:sz w:val="18"/>
-              </w:rPr>
-              <w:t>Base de datos prod</w:t>
-            </w:r>
-          </w:p>
-        </w:tc>
-        <w:tc>
-          <w:tcPr>
-            <w:tcW w:type="dxa" w:w="5669"/>
-          </w:tcPr>
-          <w:p>
-            <w:r/>
-            <w:r>
-              <w:rPr>
-                <w:sz w:val="18"/>
-              </w:rPr>
-              <w:t>PostgreSQL 16 + Redis 7 (docker-compose)</w:t>
-            </w:r>
-          </w:p>
-        </w:tc>
-      </w:tr>
-      <w:tr>
-        <w:tc>
-          <w:tcPr>
-            <w:tcW w:type="dxa" w:w="3402"/>
-          </w:tcPr>
-          <w:p>
-            <w:r/>
-            <w:r>
-              <w:rPr>
-                <w:sz w:val="18"/>
-              </w:rPr>
-              <w:t>Control de versiones</w:t>
-            </w:r>
-          </w:p>
-        </w:tc>
-        <w:tc>
-          <w:tcPr>
-            <w:tcW w:type="dxa" w:w="5669"/>
+            <w:tcW w:type="dxa" w:w="2551"/>
           </w:tcPr>
           <w:p>
             <w:r/>
@@ -2252,11 +1566,9 @@
             </w:r>
           </w:p>
         </w:tc>
-      </w:tr>
-      <w:tr>
         <w:tc>
           <w:tcPr>
-            <w:tcW w:type="dxa" w:w="3402"/>
+            <w:tcW w:type="dxa" w:w="2268"/>
           </w:tcPr>
           <w:p>
             <w:r/>
@@ -2264,13 +1576,29 @@
               <w:rPr>
                 <w:sz w:val="18"/>
               </w:rPr>
-              <w:t>Navegador de pruebas</w:t>
+              <w:t>—</w:t>
             </w:r>
           </w:p>
         </w:tc>
         <w:tc>
           <w:tcPr>
-            <w:tcW w:type="dxa" w:w="5669"/>
+            <w:tcW w:type="dxa" w:w="4252"/>
+          </w:tcPr>
+          <w:p>
+            <w:r/>
+            <w:r>
+              <w:rPr>
+                <w:sz w:val="18"/>
+              </w:rPr>
+              <w:t>Versiones</w:t>
+            </w:r>
+          </w:p>
+        </w:tc>
+      </w:tr>
+      <w:tr>
+        <w:tc>
+          <w:tcPr>
+            <w:tcW w:type="dxa" w:w="2551"/>
           </w:tcPr>
           <w:p>
             <w:r/>
@@ -2282,11 +1610,9 @@
             </w:r>
           </w:p>
         </w:tc>
-      </w:tr>
-      <w:tr>
         <w:tc>
           <w:tcPr>
-            <w:tcW w:type="dxa" w:w="3402"/>
+            <w:tcW w:type="dxa" w:w="2268"/>
           </w:tcPr>
           <w:p>
             <w:r/>
@@ -2294,13 +1620,13 @@
               <w:rPr>
                 <w:sz w:val="18"/>
               </w:rPr>
-              <w:t>SO de desarrollo</w:t>
+              <w:t>—</w:t>
             </w:r>
           </w:p>
         </w:tc>
         <w:tc>
           <w:tcPr>
-            <w:tcW w:type="dxa" w:w="5669"/>
+            <w:tcW w:type="dxa" w:w="4252"/>
           </w:tcPr>
           <w:p>
             <w:r/>
@@ -2308,7 +1634,51 @@
               <w:rPr>
                 <w:sz w:val="18"/>
               </w:rPr>
-              <w:t>Windows + PowerShell 5.1</w:t>
+              <w:t>Pruebas e2e</w:t>
+            </w:r>
+          </w:p>
+        </w:tc>
+      </w:tr>
+      <w:tr>
+        <w:tc>
+          <w:tcPr>
+            <w:tcW w:type="dxa" w:w="2551"/>
+          </w:tcPr>
+          <w:p>
+            <w:r/>
+            <w:r>
+              <w:rPr>
+                <w:sz w:val="18"/>
+              </w:rPr>
+              <w:t>Windows + PowerShell</w:t>
+            </w:r>
+          </w:p>
+        </w:tc>
+        <w:tc>
+          <w:tcPr>
+            <w:tcW w:type="dxa" w:w="2268"/>
+          </w:tcPr>
+          <w:p>
+            <w:r/>
+            <w:r>
+              <w:rPr>
+                <w:sz w:val="18"/>
+              </w:rPr>
+              <w:t>5.1</w:t>
+            </w:r>
+          </w:p>
+        </w:tc>
+        <w:tc>
+          <w:tcPr>
+            <w:tcW w:type="dxa" w:w="4252"/>
+          </w:tcPr>
+          <w:p>
+            <w:r/>
+            <w:r>
+              <w:rPr>
+                <w:sz w:val="18"/>
+              </w:rPr>
+              <w:t>SO desarrollo</w:t>
             </w:r>
           </w:p>
         </w:tc>
@@ -2317,7 +1687,7 @@
     <w:p/>
     <w:p>
       <w:r>
-        <w:t>Reproducción: 1) python -m venv venv y activar; 2) pip install -r requirements.txt; 3) copiar .env.example a .env; 4) python manage.py migrate &amp;&amp; python manage.py seed_data; 5) python manage.py runserver; 6) cd frontend &amp;&amp; npm install &amp;&amp; npm run dev; 7) verificar con pytest -q y npm run build.</w:t>
+        <w:t>Cómo levantar: python -m venv venv; pip install -r requirements.txt; copiar .env.example a .env; python manage.py migrate &amp;&amp; python manage.py seed_data; python manage.py runserver (:8000); cd frontend &amp;&amp; npm install &amp;&amp; npm run dev (:3000). Verificar con pytest -q y npm run build. Demo: admin/admin, operador/operador123.</w:t>
       </w:r>
     </w:p>
     <w:p>
@@ -2328,12 +1698,12 @@
         <w:rPr>
           <w:color w:val="00843D"/>
         </w:rPr>
-        <w:t>4. Código por control de versiones (ítem 4)</w:t>
+        <w:t>5. Ítem 4 — Código por control de versiones</w:t>
       </w:r>
     </w:p>
     <w:p>
       <w:r>
-        <w:t>Repositorio remoto (público): https://github.com/Zultes-Dev/InvenXis, rama main, 18 commits convencionales (feat/fix/chore/docs/ci). Historial reciente:</w:t>
+        <w:t>Repositorio remoto (público): https://github.com/Zultes-Dev/InvenXis, rama main, 18 commits convencionales:</w:t>
       </w:r>
     </w:p>
     <w:p>
@@ -2402,7 +1772,7 @@
     </w:p>
     <w:p>
       <w:r>
-        <w:t>CI (GitHub Actions): backend (pytest --cov), frontend (build + lint) y e2e (Django + seed + Vite + Playwright).</w:t>
+        <w:t>.gitignore: venv/, __pycache__/, *.sqlite3, .env, node_modules/, frontend/dist/, test-results/. CI: backend, frontend y e2e.</w:t>
       </w:r>
     </w:p>
     <w:p>
@@ -2413,12 +1783,12 @@
         <w:rPr>
           <w:color w:val="00843D"/>
         </w:rPr>
-        <w:t>5. Acta de pruebas y aceptación (ítem 5)</w:t>
+        <w:t>6. Ítem 5 — Acta de pruebas y aceptación</w:t>
       </w:r>
     </w:p>
     <w:p>
       <w:r>
-        <w:t>5.1 Plan de pruebas manual (esperado vs. obtenido):</w:t>
+        <w:t>Este ítem solo aparece en el instrumento de evaluación. Plan ejecutado sobre el sistema real:</w:t>
       </w:r>
     </w:p>
     <w:tbl>
@@ -2709,7 +2079,7 @@
               <w:rPr>
                 <w:sz w:val="18"/>
               </w:rPr>
-              <w:t>Paginación y filtros OK</w:t>
+              <w:t>Filtros y páginas OK</w:t>
             </w:r>
           </w:p>
         </w:tc>
@@ -2781,7 +2151,7 @@
               <w:rPr>
                 <w:sz w:val="18"/>
               </w:rPr>
-              <w:t>Actualizado vía API y UI</w:t>
+              <w:t>Actualizado</w:t>
             </w:r>
           </w:p>
         </w:tc>
@@ -2853,7 +2223,7 @@
               <w:rPr>
                 <w:sz w:val="18"/>
               </w:rPr>
-              <w:t>Eliminado vía API y UI</w:t>
+              <w:t>Eliminado</w:t>
             </w:r>
           </w:p>
         </w:tc>
@@ -2911,7 +2281,7 @@
               <w:rPr>
                 <w:sz w:val="18"/>
               </w:rPr>
-              <w:t>Venta + descuento stock</w:t>
+              <w:t>Venta + descuento</w:t>
             </w:r>
           </w:p>
         </w:tc>
@@ -2925,7 +2295,7 @@
               <w:rPr>
                 <w:sz w:val="18"/>
               </w:rPr>
-              <w:t>Descuento atómico exacto</w:t>
+              <w:t>Descuento atómico</w:t>
             </w:r>
           </w:p>
         </w:tc>
@@ -2983,7 +2353,7 @@
               <w:rPr>
                 <w:sz w:val="18"/>
               </w:rPr>
-              <w:t>Rechazo 400 sin venta</w:t>
+              <w:t>Rechazo 400</w:t>
             </w:r>
           </w:p>
         </w:tc>
@@ -2997,7 +2367,7 @@
               <w:rPr>
                 <w:sz w:val="18"/>
               </w:rPr>
-              <w:t>400 + rollback total</w:t>
+              <w:t>400 + rollback</w:t>
             </w:r>
           </w:p>
         </w:tc>
@@ -3041,7 +2411,7 @@
               <w:rPr>
                 <w:sz w:val="18"/>
               </w:rPr>
-              <w:t>Facturar venta (IVA 19%)</w:t>
+              <w:t>Facturar (IVA 19%)</w:t>
             </w:r>
           </w:p>
         </w:tc>
@@ -3069,7 +2439,7 @@
               <w:rPr>
                 <w:sz w:val="18"/>
               </w:rPr>
-              <w:t>Subtotal/IVA/total exactos</w:t>
+              <w:t>Subtotal/IVA/total OK</w:t>
             </w:r>
           </w:p>
         </w:tc>
@@ -3113,7 +2483,7 @@
               <w:rPr>
                 <w:sz w:val="18"/>
               </w:rPr>
-              <w:t>Emitir FE (CUFE+UBL)</w:t>
+              <w:t>Emitir FE</w:t>
             </w:r>
           </w:p>
         </w:tc>
@@ -3127,7 +2497,7 @@
               <w:rPr>
                 <w:sz w:val="18"/>
               </w:rPr>
-              <w:t>Validada con CUFE/XML</w:t>
+              <w:t>CUFE + UBL válido</w:t>
             </w:r>
           </w:p>
         </w:tc>
@@ -3141,7 +2511,7 @@
               <w:rPr>
                 <w:sz w:val="18"/>
               </w:rPr>
-              <w:t>Aceptada mock, XML válido</w:t>
+              <w:t>Aceptada mock</w:t>
             </w:r>
           </w:p>
         </w:tc>
@@ -3199,7 +2569,7 @@
               <w:rPr>
                 <w:sz w:val="18"/>
               </w:rPr>
-              <w:t>NC + stock; operador 403</w:t>
+              <w:t>NC + 403 operador</w:t>
             </w:r>
           </w:p>
         </w:tc>
@@ -3271,7 +2641,7 @@
               <w:rPr>
                 <w:sz w:val="18"/>
               </w:rPr>
-              <w:t>Blacklist; abuso 429</w:t>
+              <w:t>Blacklist + 429</w:t>
             </w:r>
           </w:p>
         </w:tc>
@@ -3285,7 +2655,7 @@
               <w:rPr>
                 <w:sz w:val="18"/>
               </w:rPr>
-              <w:t>Blacklist y 429 OK</w:t>
+              <w:t>Ambos OK</w:t>
             </w:r>
           </w:p>
         </w:tc>
@@ -3357,7 +2727,7 @@
               <w:rPr>
                 <w:sz w:val="18"/>
               </w:rPr>
-              <w:t>Proveedor mock; falta certificado</w:t>
+              <w:t>Falta certificado</w:t>
             </w:r>
           </w:p>
         </w:tc>
@@ -3380,23 +2750,23 @@
     <w:p/>
     <w:p>
       <w:r>
-        <w:t>5.2 Ejecución y resultados. Backend: 45 pruebas pytest en verde, sin warnings. Frontend: tsc + vite build OK, oxlint 0 errores. E2E Playwright: 2/2.</w:t>
+        <w:t>Ejecución: 45 pytest en verde sin warnings; tsc + build OK; oxlint 0 errores; Playwright 2/2.</w:t>
       </w:r>
     </w:p>
     <w:p>
       <w:r>
-        <w:t>5.3 Observaciones y pendientes. TC-12 documentado con honestidad: la arquitectura prevé el proveedor real (productos/fe/proveedores.py:get_proveedor), pero la emisión productiva exige certificado digital, firma del UBL y rango autorizado. Prioridad media.</w:t>
+        <w:t>Hallazgo (TC-12). Emisión productiva exige certificado, firma UBL y proveedor; mock intercambiable en productos/fe/proveedores.py. Prioridad media.</w:t>
       </w:r>
     </w:p>
     <w:p>
       <w:pPr>
-        <w:pStyle w:val="Heading2"/>
+        <w:pStyle w:val="Heading1"/>
       </w:pPr>
       <w:r>
         <w:rPr>
           <w:color w:val="00843D"/>
         </w:rPr>
-        <w:t>5.4 Acta de aceptación (formato)</w:t>
+        <w:t>7. Acta de aceptación (formato de propuesta)</w:t>
       </w:r>
     </w:p>
     <w:tbl>
@@ -3497,7 +2867,7 @@
               <w:rPr>
                 <w:sz w:val="18"/>
               </w:rPr>
-              <w:t>GA8-220501096-AA1-EV02 — Módulos Integrados</w:t>
+              <w:t>GA8-220501096-AA1-EV02 — Módulos integrados</w:t>
             </w:r>
           </w:p>
         </w:tc>
@@ -3513,7 +2883,7 @@
               <w:rPr>
                 <w:sz w:val="18"/>
               </w:rPr>
-              <w:t>Aprendiz / Ficha</w:t>
+              <w:t>Aprendiz</w:t>
             </w:r>
           </w:p>
         </w:tc>
@@ -3527,7 +2897,67 @@
               <w:rPr>
                 <w:sz w:val="18"/>
               </w:rPr>
-              <w:t>[NOMBRE DEL APRENDIZ] / 3235904</w:t>
+              <w:t>[NOMBRE DEL APRENDIZ]</w:t>
+            </w:r>
+          </w:p>
+        </w:tc>
+      </w:tr>
+      <w:tr>
+        <w:tc>
+          <w:tcPr>
+            <w:tcW w:type="dxa" w:w="2268"/>
+          </w:tcPr>
+          <w:p>
+            <w:r/>
+            <w:r>
+              <w:rPr>
+                <w:sz w:val="18"/>
+              </w:rPr>
+              <w:t>Ficha</w:t>
+            </w:r>
+          </w:p>
+        </w:tc>
+        <w:tc>
+          <w:tcPr>
+            <w:tcW w:type="dxa" w:w="6803"/>
+          </w:tcPr>
+          <w:p>
+            <w:r/>
+            <w:r>
+              <w:rPr>
+                <w:sz w:val="18"/>
+              </w:rPr>
+              <w:t>3235904</w:t>
+            </w:r>
+          </w:p>
+        </w:tc>
+      </w:tr>
+      <w:tr>
+        <w:tc>
+          <w:tcPr>
+            <w:tcW w:type="dxa" w:w="2268"/>
+          </w:tcPr>
+          <w:p>
+            <w:r/>
+            <w:r>
+              <w:rPr>
+                <w:sz w:val="18"/>
+              </w:rPr>
+              <w:t>Instructor</w:t>
+            </w:r>
+          </w:p>
+        </w:tc>
+        <w:tc>
+          <w:tcPr>
+            <w:tcW w:type="dxa" w:w="6803"/>
+          </w:tcPr>
+          <w:p>
+            <w:r/>
+            <w:r>
+              <w:rPr>
+                <w:sz w:val="18"/>
+              </w:rPr>
+              <w:t>Carlos Alberto Fuel Tulcán</w:t>
             </w:r>
           </w:p>
         </w:tc>
@@ -3562,71 +2992,16 @@
           </w:p>
         </w:tc>
       </w:tr>
-      <w:tr>
-        <w:tc>
-          <w:tcPr>
-            <w:tcW w:type="dxa" w:w="2268"/>
-          </w:tcPr>
-          <w:p>
-            <w:r/>
-            <w:r>
-              <w:rPr>
-                <w:sz w:val="18"/>
-              </w:rPr>
-              <w:t>Resultado</w:t>
-            </w:r>
-          </w:p>
-        </w:tc>
-        <w:tc>
-          <w:tcPr>
-            <w:tcW w:type="dxa" w:w="6803"/>
-          </w:tcPr>
-          <w:p>
-            <w:r/>
-            <w:r>
-              <w:rPr>
-                <w:sz w:val="18"/>
-              </w:rPr>
-              <w:t>11 casos Cumplen / 1 pendiente documentado (TC-12)</w:t>
-            </w:r>
-          </w:p>
-        </w:tc>
-      </w:tr>
-      <w:tr>
-        <w:tc>
-          <w:tcPr>
-            <w:tcW w:type="dxa" w:w="2268"/>
-          </w:tcPr>
-          <w:p>
-            <w:r/>
-            <w:r>
-              <w:rPr>
-                <w:sz w:val="18"/>
-              </w:rPr>
-              <w:t>Soporte</w:t>
-            </w:r>
-          </w:p>
-        </w:tc>
-        <w:tc>
-          <w:tcPr>
-            <w:tcW w:type="dxa" w:w="6803"/>
-          </w:tcPr>
-          <w:p>
-            <w:r/>
-            <w:r>
-              <w:rPr>
-                <w:sz w:val="18"/>
-              </w:rPr>
-              <w:t>Repositorio Git (https://github.com/Zultes-Dev/InvenXis), pruebas automatizadas, manuales</w:t>
-            </w:r>
-          </w:p>
-        </w:tc>
-      </w:tr>
     </w:tbl>
     <w:p/>
     <w:p>
       <w:r>
-        <w:t>Declaración: el evaluador/cliente, luego de revisar la solución y verificar el cumplimiento de los requisitos, acepta el entregable con el pendiente TC-12 documentado.</w:t>
+        <w:t>Resultado: 12 casos ejecutados, 11 cumplen y 1 pendiente documentado (TC-12).</w:t>
+      </w:r>
+    </w:p>
+    <w:p>
+      <w:r>
+        <w:t>Declaración: se acepta el producto con las salvedades documentadas; la configuración aún no es apta para producción real ante la DIAN.</w:t>
       </w:r>
     </w:p>
     <w:tbl>
@@ -3652,7 +3027,7 @@
                 <w:b/>
                 <w:sz w:val="18"/>
               </w:rPr>
-              <w:t>Evaluador / Instructor</w:t>
+              <w:t>Elabora y entrega (Aprendiz)</w:t>
             </w:r>
           </w:p>
         </w:tc>
@@ -3667,7 +3042,7 @@
                 <w:b/>
                 <w:sz w:val="18"/>
               </w:rPr>
-              <w:t>Aprendiz</w:t>
+              <w:t>Recibe (Instructor)</w:t>
             </w:r>
           </w:p>
         </w:tc>
@@ -3683,11 +3058,9 @@
               <w:rPr>
                 <w:sz w:val="18"/>
               </w:rPr>
-              <w:t>Nombre: Carlos Alberto Fuel Tulcán</w:t>
+              <w:t>[NOMBRE DEL APRENDIZ] — Ficha 3235904</w:t>
               <w:br/>
               <w:t>Firma: ___________________________</w:t>
-              <w:br/>
-              <w:t>Fecha: 08 de septiembre de 2026</w:t>
             </w:r>
           </w:p>
         </w:tc>
@@ -3701,11 +3074,9 @@
               <w:rPr>
                 <w:sz w:val="18"/>
               </w:rPr>
-              <w:t>Nombre: [NOMBRE DEL APRENDIZ]</w:t>
+              <w:t>Carlos Alberto Fuel Tulcán</w:t>
               <w:br/>
               <w:t>Firma: ___________________________</w:t>
-              <w:br/>
-              <w:t>Fecha: 08 de septiembre de 2026</w:t>
             </w:r>
           </w:p>
         </w:tc>
@@ -3720,20 +3091,35 @@
         <w:rPr>
           <w:color w:val="00843D"/>
         </w:rPr>
-        <w:t>A. Anexos</w:t>
+        <w:t>8. Anexos</w:t>
       </w:r>
     </w:p>
     <w:p>
+      <w:pPr>
+        <w:pStyle w:val="ListBullet"/>
+      </w:pPr>
       <w:r>
-        <w:t>Endpoints (base /api/): auth/login, auth/refresh, auth/logout, auth/me, productos/, proveedores/, pedidos, ventas, ventas/{id}/facturar/, facturas (+emitir/anular/pdf/ubl), notas-credito/, dashboard/, reportes/*, exportar, health/, docs/, redoc/.</w:t>
+        <w:t>Anexo A: diagrama entidad-relación — docs/ev02/ER-InvenXis.svg (11 entidades, 13 relaciones; Mermaid en ER-InvenXis.mmd).</w:t>
       </w:r>
     </w:p>
     <w:p>
+      <w:pPr>
+        <w:pStyle w:val="ListBullet"/>
+      </w:pPr>
       <w:r>
-        <w:t>Credenciales demo (solo desarrollo): admin/admin, operador/operador123. App http://localhost:3000, API http://127.0.0.1:8000, docs /api/docs/, admin /admin/, repo https://github.com/Zultes-Dev/InvenXis.</w:t>
+        <w:t>Anexo B: capturas del sistema funcionando — docs/ev02/anexos/01-login.png, 02-dashboard.png, 03-productos.png, 04-facturacion.png (Playwright contra el sistema real).</w:t>
+      </w:r>
+    </w:p>
+    <w:p>
+      <w:pPr>
+        <w:pStyle w:val="ListBullet"/>
+      </w:pPr>
+      <w:r>
+        <w:t>Anexo C: repositorio remoto con historial — https://github.com/Zultes-Dev/InvenXis.</w:t>
       </w:r>
     </w:p>
     <w:sectPr>
+      <w:footerReference w:type="default" r:id="rId9"/>
       <w:pgSz w:w="12240" w:h="15840"/>
       <w:pgMar w:top="1440" w:right="1134" w:bottom="1440" w:left="1134" w:header="720" w:footer="720" w:gutter="0"/>
       <w:cols w:space="720"/>
@@ -3741,6 +3127,32 @@
     </w:sectPr>
   </w:body>
 </w:document>
+</file>
+
+<file path=word/footer1.xml><?xml version="1.0" encoding="utf-8"?>
+<w:ftr xmlns:m="http://schemas.openxmlformats.org/officeDocument/2006/math" xmlns:mc="http://schemas.openxmlformats.org/markup-compatibility/2006" xmlns:mo="http://schemas.microsoft.com/office/mac/office/2008/main" xmlns:mv="urn:schemas-microsoft-com:mac:vml" xmlns:o="urn:schemas-microsoft-com:office:office" xmlns:r="http://schemas.openxmlformats.org/officeDocument/2006/relationships" xmlns:v="urn:schemas-microsoft-com:vml" xmlns:w10="urn:schemas-microsoft-com:office:word" xmlns:w14="http://schemas.microsoft.com/office/word/2010/wordml" xmlns:w="http://schemas.openxmlformats.org/wordprocessingml/2006/main" xmlns:wne="http://schemas.microsoft.com/office/word/2006/wordml" xmlns:wp14="http://schemas.microsoft.com/office/word/2010/wordprocessingDrawing" xmlns:wp="http://schemas.openxmlformats.org/drawingml/2006/wordprocessingDrawing" xmlns:wpc="http://schemas.microsoft.com/office/word/2010/wordprocessingCanvas" xmlns:wpg="http://schemas.microsoft.com/office/word/2010/wordprocessingGroup" xmlns:wpi="http://schemas.microsoft.com/office/word/2010/wordprocessingInk" xmlns:wps="http://schemas.microsoft.com/office/word/2010/wordprocessingShape" mc:Ignorable="w14 wp14">
+  <w:p>
+    <w:pPr>
+      <w:pStyle w:val="Footer"/>
+      <w:jc w:val="center"/>
+    </w:pPr>
+    <w:r>
+      <w:rPr>
+        <w:sz w:val="16"/>
+      </w:rPr>
+      <w:t xml:space="preserve">GA8-220501096-AA1-EV02 · Página </w:t>
+    </w:r>
+    <w:r>
+      <w:fldChar w:fldCharType="begin"/>
+    </w:r>
+    <w:r>
+      <w:instrText xml:space="preserve">PAGE</w:instrText>
+    </w:r>
+    <w:r>
+      <w:fldChar w:fldCharType="end"/>
+    </w:r>
+  </w:p>
+</w:ftr>
 </file>
 
 <file path=word/numbering.xml><?xml version="1.0" encoding="utf-8"?>

</xml_diff>

<commit_message>
docs: anexo D con codigo por modulo (7 capturas verificadas)
</commit_message>
<xml_diff>
--- a/docs/ev02/EV02-InvenXis-GA8-220501096-AA1-EV02.docx
+++ b/docs/ev02/EV02-InvenXis-GA8-220501096-AA1-EV02.docx
@@ -3118,6 +3118,14 @@
         <w:t>Anexo C: repositorio remoto con historial — https://github.com/Zultes-Dev/InvenXis.</w:t>
       </w:r>
     </w:p>
+    <w:p>
+      <w:pPr>
+        <w:pStyle w:val="ListBullet"/>
+      </w:pPr>
+      <w:r>
+        <w:t>Anexo D: código por módulo — docs/ev02/anexos/codigo-01-autenticacion.png … codigo-07-frontend.png (extractos reales con resaltado, generados con docs/ev02/generar_codigo_png.py).</w:t>
+      </w:r>
+    </w:p>
     <w:sectPr>
       <w:footerReference w:type="default" r:id="rId9"/>
       <w:pgSz w:w="12240" w:h="15840"/>

</xml_diff>